<commit_message>
Added sql script files
</commit_message>
<xml_diff>
--- a/docs/00_GitHub_Development_Guide.docx
+++ b/docs/00_GitHub_Development_Guide.docx
@@ -140,7 +140,7 @@
     <w:sdt>
       <w:sdtPr>
         <w:alias w:val="Contents"/>
-        <w:id w:val="-2081827422"/>
+        <w:id w:val="303350788"/>
       </w:sdtPr>
       <w:sdtEndPr/>
       <w:sdtContent>
@@ -163,7 +163,7 @@
           <w:r>
             <w:fldChar w:fldCharType="separate"/>
           </w:r>
-          <w:hyperlink w:anchor="_Toc240468863" w:history="1">
+          <w:hyperlink w:anchor="_Toc240555478" w:history="1">
             <w:r>
               <w:rPr>
                 <w:rStyle w:val="Hyperlink"/>
@@ -189,7 +189,7 @@
               <w:rPr>
                 <w:noProof/>
               </w:rPr>
-              <w:instrText xml:space="preserve"> PAGEREF _Toc240468863 \h </w:instrText>
+              <w:instrText xml:space="preserve"> PAGEREF _Toc240555478 \h </w:instrText>
             </w:r>
             <w:r>
               <w:rPr>
@@ -226,7 +226,7 @@
               <w:noProof/>
             </w:rPr>
           </w:pPr>
-          <w:hyperlink w:anchor="_Toc240468864" w:history="1">
+          <w:hyperlink w:anchor="_Toc240555479" w:history="1">
             <w:r>
               <w:rPr>
                 <w:rStyle w:val="Hyperlink"/>
@@ -252,7 +252,7 @@
               <w:rPr>
                 <w:noProof/>
               </w:rPr>
-              <w:instrText xml:space="preserve"> PAGEREF _Toc240468864 \h </w:instrText>
+              <w:instrText xml:space="preserve"> PAGEREF _Toc240555479 \h </w:instrText>
             </w:r>
             <w:r>
               <w:rPr>
@@ -289,7 +289,7 @@
               <w:noProof/>
             </w:rPr>
           </w:pPr>
-          <w:hyperlink w:anchor="_Toc240468865" w:history="1">
+          <w:hyperlink w:anchor="_Toc240555480" w:history="1">
             <w:r>
               <w:rPr>
                 <w:rStyle w:val="Hyperlink"/>
@@ -315,7 +315,7 @@
               <w:rPr>
                 <w:noProof/>
               </w:rPr>
-              <w:instrText xml:space="preserve"> PAGEREF _Toc240468865 \h </w:instrText>
+              <w:instrText xml:space="preserve"> PAGEREF _Toc240555480 \h </w:instrText>
             </w:r>
             <w:r>
               <w:rPr>
@@ -352,7 +352,7 @@
               <w:noProof/>
             </w:rPr>
           </w:pPr>
-          <w:hyperlink w:anchor="_Toc240468866" w:history="1">
+          <w:hyperlink w:anchor="_Toc240555481" w:history="1">
             <w:r>
               <w:rPr>
                 <w:rStyle w:val="Hyperlink"/>
@@ -378,7 +378,7 @@
               <w:rPr>
                 <w:noProof/>
               </w:rPr>
-              <w:instrText xml:space="preserve"> PAGEREF _Toc240468866 \h </w:instrText>
+              <w:instrText xml:space="preserve"> PAGEREF _Toc240555481 \h </w:instrText>
             </w:r>
             <w:r>
               <w:rPr>
@@ -415,7 +415,7 @@
               <w:noProof/>
             </w:rPr>
           </w:pPr>
-          <w:hyperlink w:anchor="_Toc240468867" w:history="1">
+          <w:hyperlink w:anchor="_Toc240555482" w:history="1">
             <w:r>
               <w:rPr>
                 <w:rStyle w:val="Hyperlink"/>
@@ -441,7 +441,7 @@
               <w:rPr>
                 <w:noProof/>
               </w:rPr>
-              <w:instrText xml:space="preserve"> PAGEREF _Toc240468867 \h </w:instrText>
+              <w:instrText xml:space="preserve"> PAGEREF _Toc240555482 \h </w:instrText>
             </w:r>
             <w:r>
               <w:rPr>
@@ -478,7 +478,7 @@
               <w:noProof/>
             </w:rPr>
           </w:pPr>
-          <w:hyperlink w:anchor="_Toc240468868" w:history="1">
+          <w:hyperlink w:anchor="_Toc240555483" w:history="1">
             <w:r>
               <w:rPr>
                 <w:rStyle w:val="Hyperlink"/>
@@ -504,7 +504,7 @@
               <w:rPr>
                 <w:noProof/>
               </w:rPr>
-              <w:instrText xml:space="preserve"> PAGEREF _Toc240468868 \h </w:instrText>
+              <w:instrText xml:space="preserve"> PAGEREF _Toc240555483 \h </w:instrText>
             </w:r>
             <w:r>
               <w:rPr>
@@ -541,7 +541,7 @@
               <w:noProof/>
             </w:rPr>
           </w:pPr>
-          <w:hyperlink w:anchor="_Toc240468869" w:history="1">
+          <w:hyperlink w:anchor="_Toc240555484" w:history="1">
             <w:r>
               <w:rPr>
                 <w:rStyle w:val="Hyperlink"/>
@@ -567,7 +567,7 @@
               <w:rPr>
                 <w:noProof/>
               </w:rPr>
-              <w:instrText xml:space="preserve"> PAGEREF _Toc240468869 \h </w:instrText>
+              <w:instrText xml:space="preserve"> PAGEREF _Toc240555484 \h </w:instrText>
             </w:r>
             <w:r>
               <w:rPr>
@@ -604,7 +604,7 @@
               <w:noProof/>
             </w:rPr>
           </w:pPr>
-          <w:hyperlink w:anchor="_Toc240468870" w:history="1">
+          <w:hyperlink w:anchor="_Toc240555485" w:history="1">
             <w:r>
               <w:rPr>
                 <w:rStyle w:val="Hyperlink"/>
@@ -630,7 +630,7 @@
               <w:rPr>
                 <w:noProof/>
               </w:rPr>
-              <w:instrText xml:space="preserve"> PAGEREF _Toc240468870 \h </w:instrText>
+              <w:instrText xml:space="preserve"> PAGEREF _Toc240555485 \h </w:instrText>
             </w:r>
             <w:r>
               <w:rPr>
@@ -667,7 +667,7 @@
               <w:noProof/>
             </w:rPr>
           </w:pPr>
-          <w:hyperlink w:anchor="_Toc240468871" w:history="1">
+          <w:hyperlink w:anchor="_Toc240555486" w:history="1">
             <w:r>
               <w:rPr>
                 <w:rStyle w:val="Hyperlink"/>
@@ -693,7 +693,7 @@
               <w:rPr>
                 <w:noProof/>
               </w:rPr>
-              <w:instrText xml:space="preserve"> PAGEREF _Toc240468871 \h </w:instrText>
+              <w:instrText xml:space="preserve"> PAGEREF _Toc240555486 \h </w:instrText>
             </w:r>
             <w:r>
               <w:rPr>
@@ -730,7 +730,7 @@
               <w:noProof/>
             </w:rPr>
           </w:pPr>
-          <w:hyperlink w:anchor="_Toc240468872" w:history="1">
+          <w:hyperlink w:anchor="_Toc240555487" w:history="1">
             <w:r>
               <w:rPr>
                 <w:rStyle w:val="Hyperlink"/>
@@ -756,7 +756,7 @@
               <w:rPr>
                 <w:noProof/>
               </w:rPr>
-              <w:instrText xml:space="preserve"> PAGEREF _Toc240468872 \h </w:instrText>
+              <w:instrText xml:space="preserve"> PAGEREF _Toc240555487 \h </w:instrText>
             </w:r>
             <w:r>
               <w:rPr>
@@ -793,7 +793,7 @@
               <w:noProof/>
             </w:rPr>
           </w:pPr>
-          <w:hyperlink w:anchor="_Toc240468873" w:history="1">
+          <w:hyperlink w:anchor="_Toc240555488" w:history="1">
             <w:r>
               <w:rPr>
                 <w:rStyle w:val="Hyperlink"/>
@@ -819,7 +819,7 @@
               <w:rPr>
                 <w:noProof/>
               </w:rPr>
-              <w:instrText xml:space="preserve"> PAGEREF _Toc240468873 \h </w:instrText>
+              <w:instrText xml:space="preserve"> PAGEREF _Toc240555488 \h </w:instrText>
             </w:r>
             <w:r>
               <w:rPr>
@@ -856,7 +856,7 @@
               <w:noProof/>
             </w:rPr>
           </w:pPr>
-          <w:hyperlink w:anchor="_Toc240468874" w:history="1">
+          <w:hyperlink w:anchor="_Toc240555489" w:history="1">
             <w:r>
               <w:rPr>
                 <w:rStyle w:val="Hyperlink"/>
@@ -882,7 +882,7 @@
               <w:rPr>
                 <w:noProof/>
               </w:rPr>
-              <w:instrText xml:space="preserve"> PAGEREF _Toc240468874 \h </w:instrText>
+              <w:instrText xml:space="preserve"> PAGEREF _Toc240555489 \h </w:instrText>
             </w:r>
             <w:r>
               <w:rPr>
@@ -919,7 +919,7 @@
               <w:noProof/>
             </w:rPr>
           </w:pPr>
-          <w:hyperlink w:anchor="_Toc240468875" w:history="1">
+          <w:hyperlink w:anchor="_Toc240555490" w:history="1">
             <w:r>
               <w:rPr>
                 <w:rStyle w:val="Hyperlink"/>
@@ -945,7 +945,7 @@
               <w:rPr>
                 <w:noProof/>
               </w:rPr>
-              <w:instrText xml:space="preserve"> PAGEREF _Toc240468875 \h </w:instrText>
+              <w:instrText xml:space="preserve"> PAGEREF _Toc240555490 \h </w:instrText>
             </w:r>
             <w:r>
               <w:rPr>
@@ -982,7 +982,7 @@
               <w:noProof/>
             </w:rPr>
           </w:pPr>
-          <w:hyperlink w:anchor="_Toc240468876" w:history="1">
+          <w:hyperlink w:anchor="_Toc240555491" w:history="1">
             <w:r>
               <w:rPr>
                 <w:rStyle w:val="Hyperlink"/>
@@ -1008,7 +1008,7 @@
               <w:rPr>
                 <w:noProof/>
               </w:rPr>
-              <w:instrText xml:space="preserve"> PAGEREF _Toc240468876 \h </w:instrText>
+              <w:instrText xml:space="preserve"> PAGEREF _Toc240555491 \h </w:instrText>
             </w:r>
             <w:r>
               <w:rPr>
@@ -1045,7 +1045,7 @@
               <w:noProof/>
             </w:rPr>
           </w:pPr>
-          <w:hyperlink w:anchor="_Toc240468877" w:history="1">
+          <w:hyperlink w:anchor="_Toc240555492" w:history="1">
             <w:r>
               <w:rPr>
                 <w:rStyle w:val="Hyperlink"/>
@@ -1071,7 +1071,7 @@
               <w:rPr>
                 <w:noProof/>
               </w:rPr>
-              <w:instrText xml:space="preserve"> PAGEREF _Toc240468877 \h </w:instrText>
+              <w:instrText xml:space="preserve"> PAGEREF _Toc240555492 \h </w:instrText>
             </w:r>
             <w:r>
               <w:rPr>
@@ -1108,7 +1108,7 @@
               <w:noProof/>
             </w:rPr>
           </w:pPr>
-          <w:hyperlink w:anchor="_Toc240468878" w:history="1">
+          <w:hyperlink w:anchor="_Toc240555493" w:history="1">
             <w:r>
               <w:rPr>
                 <w:rStyle w:val="Hyperlink"/>
@@ -1134,7 +1134,7 @@
               <w:rPr>
                 <w:noProof/>
               </w:rPr>
-              <w:instrText xml:space="preserve"> PAGEREF _Toc240468878 \h </w:instrText>
+              <w:instrText xml:space="preserve"> PAGEREF _Toc240555493 \h </w:instrText>
             </w:r>
             <w:r>
               <w:rPr>
@@ -1171,7 +1171,7 @@
               <w:noProof/>
             </w:rPr>
           </w:pPr>
-          <w:hyperlink w:anchor="_Toc240468879" w:history="1">
+          <w:hyperlink w:anchor="_Toc240555494" w:history="1">
             <w:r>
               <w:rPr>
                 <w:rStyle w:val="Hyperlink"/>
@@ -1197,7 +1197,7 @@
               <w:rPr>
                 <w:noProof/>
               </w:rPr>
-              <w:instrText xml:space="preserve"> PAGEREF _Toc240468879 \h </w:instrText>
+              <w:instrText xml:space="preserve"> PAGEREF _Toc240555494 \h </w:instrText>
             </w:r>
             <w:r>
               <w:rPr>
@@ -1234,7 +1234,7 @@
               <w:noProof/>
             </w:rPr>
           </w:pPr>
-          <w:hyperlink w:anchor="_Toc240468880" w:history="1">
+          <w:hyperlink w:anchor="_Toc240555495" w:history="1">
             <w:r>
               <w:rPr>
                 <w:rStyle w:val="Hyperlink"/>
@@ -1260,7 +1260,7 @@
               <w:rPr>
                 <w:noProof/>
               </w:rPr>
-              <w:instrText xml:space="preserve"> PAGEREF _Toc240468880 \h </w:instrText>
+              <w:instrText xml:space="preserve"> PAGEREF _Toc240555495 \h </w:instrText>
             </w:r>
             <w:r>
               <w:rPr>
@@ -1297,7 +1297,7 @@
               <w:noProof/>
             </w:rPr>
           </w:pPr>
-          <w:hyperlink w:anchor="_Toc240468881" w:history="1">
+          <w:hyperlink w:anchor="_Toc240555496" w:history="1">
             <w:r>
               <w:rPr>
                 <w:rStyle w:val="Hyperlink"/>
@@ -1323,7 +1323,7 @@
               <w:rPr>
                 <w:noProof/>
               </w:rPr>
-              <w:instrText xml:space="preserve"> PAGEREF _Toc240468881 \h </w:instrText>
+              <w:instrText xml:space="preserve"> PAGEREF _Toc240555496 \h </w:instrText>
             </w:r>
             <w:r>
               <w:rPr>
@@ -1360,7 +1360,7 @@
               <w:noProof/>
             </w:rPr>
           </w:pPr>
-          <w:hyperlink w:anchor="_Toc240468882" w:history="1">
+          <w:hyperlink w:anchor="_Toc240555497" w:history="1">
             <w:r>
               <w:rPr>
                 <w:rStyle w:val="Hyperlink"/>
@@ -1386,7 +1386,7 @@
               <w:rPr>
                 <w:noProof/>
               </w:rPr>
-              <w:instrText xml:space="preserve"> PAGEREF _Toc240468882 \h </w:instrText>
+              <w:instrText xml:space="preserve"> PAGEREF _Toc240555497 \h </w:instrText>
             </w:r>
             <w:r>
               <w:rPr>
@@ -1423,7 +1423,7 @@
               <w:noProof/>
             </w:rPr>
           </w:pPr>
-          <w:hyperlink w:anchor="_Toc240468883" w:history="1">
+          <w:hyperlink w:anchor="_Toc240555498" w:history="1">
             <w:r>
               <w:rPr>
                 <w:rStyle w:val="Hyperlink"/>
@@ -1449,7 +1449,7 @@
               <w:rPr>
                 <w:noProof/>
               </w:rPr>
-              <w:instrText xml:space="preserve"> PAGEREF _Toc240468883 \h </w:instrText>
+              <w:instrText xml:space="preserve"> PAGEREF _Toc240555498 \h </w:instrText>
             </w:r>
             <w:r>
               <w:rPr>
@@ -1486,7 +1486,7 @@
               <w:noProof/>
             </w:rPr>
           </w:pPr>
-          <w:hyperlink w:anchor="_Toc240468884" w:history="1">
+          <w:hyperlink w:anchor="_Toc240555499" w:history="1">
             <w:r>
               <w:rPr>
                 <w:rStyle w:val="Hyperlink"/>
@@ -1512,7 +1512,7 @@
               <w:rPr>
                 <w:noProof/>
               </w:rPr>
-              <w:instrText xml:space="preserve"> PAGEREF _Toc240468884 \h </w:instrText>
+              <w:instrText xml:space="preserve"> PAGEREF _Toc240555499 \h </w:instrText>
             </w:r>
             <w:r>
               <w:rPr>
@@ -1549,7 +1549,7 @@
               <w:noProof/>
             </w:rPr>
           </w:pPr>
-          <w:hyperlink w:anchor="_Toc240468885" w:history="1">
+          <w:hyperlink w:anchor="_Toc240555500" w:history="1">
             <w:r>
               <w:rPr>
                 <w:rStyle w:val="Hyperlink"/>
@@ -1575,7 +1575,7 @@
               <w:rPr>
                 <w:noProof/>
               </w:rPr>
-              <w:instrText xml:space="preserve"> PAGEREF _Toc240468885 \h </w:instrText>
+              <w:instrText xml:space="preserve"> PAGEREF _Toc240555500 \h </w:instrText>
             </w:r>
             <w:r>
               <w:rPr>
@@ -1612,7 +1612,7 @@
               <w:noProof/>
             </w:rPr>
           </w:pPr>
-          <w:hyperlink w:anchor="_Toc240468886" w:history="1">
+          <w:hyperlink w:anchor="_Toc240555501" w:history="1">
             <w:r>
               <w:rPr>
                 <w:rStyle w:val="Hyperlink"/>
@@ -1638,7 +1638,7 @@
               <w:rPr>
                 <w:noProof/>
               </w:rPr>
-              <w:instrText xml:space="preserve"> PAGEREF _Toc240468886 \h </w:instrText>
+              <w:instrText xml:space="preserve"> PAGEREF _Toc240555501 \h </w:instrText>
             </w:r>
             <w:r>
               <w:rPr>
@@ -1675,7 +1675,7 @@
               <w:noProof/>
             </w:rPr>
           </w:pPr>
-          <w:hyperlink w:anchor="_Toc240468887" w:history="1">
+          <w:hyperlink w:anchor="_Toc240555502" w:history="1">
             <w:r>
               <w:rPr>
                 <w:rStyle w:val="Hyperlink"/>
@@ -1701,7 +1701,7 @@
               <w:rPr>
                 <w:noProof/>
               </w:rPr>
-              <w:instrText xml:space="preserve"> PAGEREF _Toc240468887 \h </w:instrText>
+              <w:instrText xml:space="preserve"> PAGEREF _Toc240555502 \h </w:instrText>
             </w:r>
             <w:r>
               <w:rPr>
@@ -1738,7 +1738,7 @@
               <w:noProof/>
             </w:rPr>
           </w:pPr>
-          <w:hyperlink w:anchor="_Toc240468888" w:history="1">
+          <w:hyperlink w:anchor="_Toc240555503" w:history="1">
             <w:r>
               <w:rPr>
                 <w:rStyle w:val="Hyperlink"/>
@@ -1764,7 +1764,7 @@
               <w:rPr>
                 <w:noProof/>
               </w:rPr>
-              <w:instrText xml:space="preserve"> PAGEREF _Toc240468888 \h </w:instrText>
+              <w:instrText xml:space="preserve"> PAGEREF _Toc240555503 \h </w:instrText>
             </w:r>
             <w:r>
               <w:rPr>
@@ -1801,7 +1801,7 @@
               <w:noProof/>
             </w:rPr>
           </w:pPr>
-          <w:hyperlink w:anchor="_Toc240468889" w:history="1">
+          <w:hyperlink w:anchor="_Toc240555504" w:history="1">
             <w:r>
               <w:rPr>
                 <w:rStyle w:val="Hyperlink"/>
@@ -1827,7 +1827,7 @@
               <w:rPr>
                 <w:noProof/>
               </w:rPr>
-              <w:instrText xml:space="preserve"> PAGEREF _Toc240468889 \h </w:instrText>
+              <w:instrText xml:space="preserve"> PAGEREF _Toc240555504 \h </w:instrText>
             </w:r>
             <w:r>
               <w:rPr>
@@ -1864,7 +1864,7 @@
               <w:noProof/>
             </w:rPr>
           </w:pPr>
-          <w:hyperlink w:anchor="_Toc240468890" w:history="1">
+          <w:hyperlink w:anchor="_Toc240555505" w:history="1">
             <w:r>
               <w:rPr>
                 <w:rStyle w:val="Hyperlink"/>
@@ -1890,7 +1890,7 @@
               <w:rPr>
                 <w:noProof/>
               </w:rPr>
-              <w:instrText xml:space="preserve"> PAGEREF _Toc240468890 \h </w:instrText>
+              <w:instrText xml:space="preserve"> PAGEREF _Toc240555505 \h </w:instrText>
             </w:r>
             <w:r>
               <w:rPr>
@@ -1927,7 +1927,7 @@
               <w:noProof/>
             </w:rPr>
           </w:pPr>
-          <w:hyperlink w:anchor="_Toc240468891" w:history="1">
+          <w:hyperlink w:anchor="_Toc240555506" w:history="1">
             <w:r>
               <w:rPr>
                 <w:rStyle w:val="Hyperlink"/>
@@ -1953,7 +1953,7 @@
               <w:rPr>
                 <w:noProof/>
               </w:rPr>
-              <w:instrText xml:space="preserve"> PAGEREF _Toc240468891 \h </w:instrText>
+              <w:instrText xml:space="preserve"> PAGEREF _Toc240555506 \h </w:instrText>
             </w:r>
             <w:r>
               <w:rPr>
@@ -1990,7 +1990,7 @@
               <w:noProof/>
             </w:rPr>
           </w:pPr>
-          <w:hyperlink w:anchor="_Toc240468892" w:history="1">
+          <w:hyperlink w:anchor="_Toc240555507" w:history="1">
             <w:r>
               <w:rPr>
                 <w:rStyle w:val="Hyperlink"/>
@@ -2016,7 +2016,7 @@
               <w:rPr>
                 <w:noProof/>
               </w:rPr>
-              <w:instrText xml:space="preserve"> PAGEREF _Toc240468892 \h </w:instrText>
+              <w:instrText xml:space="preserve"> PAGEREF _Toc240555507 \h </w:instrText>
             </w:r>
             <w:r>
               <w:rPr>
@@ -2053,7 +2053,7 @@
               <w:noProof/>
             </w:rPr>
           </w:pPr>
-          <w:hyperlink w:anchor="_Toc240468893" w:history="1">
+          <w:hyperlink w:anchor="_Toc240555508" w:history="1">
             <w:r>
               <w:rPr>
                 <w:rStyle w:val="Hyperlink"/>
@@ -2079,7 +2079,7 @@
               <w:rPr>
                 <w:noProof/>
               </w:rPr>
-              <w:instrText xml:space="preserve"> PAGEREF _Toc240468893 \h </w:instrText>
+              <w:instrText xml:space="preserve"> PAGEREF _Toc240555508 \h </w:instrText>
             </w:r>
             <w:r>
               <w:rPr>
@@ -2116,7 +2116,7 @@
               <w:noProof/>
             </w:rPr>
           </w:pPr>
-          <w:hyperlink w:anchor="_Toc240468894" w:history="1">
+          <w:hyperlink w:anchor="_Toc240555509" w:history="1">
             <w:r>
               <w:rPr>
                 <w:rStyle w:val="Hyperlink"/>
@@ -2142,7 +2142,7 @@
               <w:rPr>
                 <w:noProof/>
               </w:rPr>
-              <w:instrText xml:space="preserve"> PAGEREF _Toc240468894 \h </w:instrText>
+              <w:instrText xml:space="preserve"> PAGEREF _Toc240555509 \h </w:instrText>
             </w:r>
             <w:r>
               <w:rPr>
@@ -2179,7 +2179,7 @@
               <w:noProof/>
             </w:rPr>
           </w:pPr>
-          <w:hyperlink w:anchor="_Toc240468895" w:history="1">
+          <w:hyperlink w:anchor="_Toc240555510" w:history="1">
             <w:r>
               <w:rPr>
                 <w:rStyle w:val="Hyperlink"/>
@@ -2205,7 +2205,7 @@
               <w:rPr>
                 <w:noProof/>
               </w:rPr>
-              <w:instrText xml:space="preserve"> PAGEREF _Toc240468895 \h </w:instrText>
+              <w:instrText xml:space="preserve"> PAGEREF _Toc240555510 \h </w:instrText>
             </w:r>
             <w:r>
               <w:rPr>
@@ -2242,7 +2242,7 @@
               <w:noProof/>
             </w:rPr>
           </w:pPr>
-          <w:hyperlink w:anchor="_Toc240468896" w:history="1">
+          <w:hyperlink w:anchor="_Toc240555511" w:history="1">
             <w:r>
               <w:rPr>
                 <w:rStyle w:val="Hyperlink"/>
@@ -2268,7 +2268,7 @@
               <w:rPr>
                 <w:noProof/>
               </w:rPr>
-              <w:instrText xml:space="preserve"> PAGEREF _Toc240468896 \h </w:instrText>
+              <w:instrText xml:space="preserve"> PAGEREF _Toc240555511 \h </w:instrText>
             </w:r>
             <w:r>
               <w:rPr>
@@ -2305,7 +2305,7 @@
               <w:noProof/>
             </w:rPr>
           </w:pPr>
-          <w:hyperlink w:anchor="_Toc240468897" w:history="1">
+          <w:hyperlink w:anchor="_Toc240555512" w:history="1">
             <w:r>
               <w:rPr>
                 <w:rStyle w:val="Hyperlink"/>
@@ -2331,7 +2331,7 @@
               <w:rPr>
                 <w:noProof/>
               </w:rPr>
-              <w:instrText xml:space="preserve"> PAGEREF _Toc240468897 \h </w:instrText>
+              <w:instrText xml:space="preserve"> PAGEREF _Toc240555512 \h </w:instrText>
             </w:r>
             <w:r>
               <w:rPr>
@@ -2368,7 +2368,7 @@
               <w:noProof/>
             </w:rPr>
           </w:pPr>
-          <w:hyperlink w:anchor="_Toc240468898" w:history="1">
+          <w:hyperlink w:anchor="_Toc240555513" w:history="1">
             <w:r>
               <w:rPr>
                 <w:rStyle w:val="Hyperlink"/>
@@ -2394,7 +2394,7 @@
               <w:rPr>
                 <w:noProof/>
               </w:rPr>
-              <w:instrText xml:space="preserve"> PAGEREF _Toc240468898 \h </w:instrText>
+              <w:instrText xml:space="preserve"> PAGEREF _Toc240555513 \h </w:instrText>
             </w:r>
             <w:r>
               <w:rPr>
@@ -2431,7 +2431,7 @@
               <w:noProof/>
             </w:rPr>
           </w:pPr>
-          <w:hyperlink w:anchor="_Toc240468899" w:history="1">
+          <w:hyperlink w:anchor="_Toc240555514" w:history="1">
             <w:r>
               <w:rPr>
                 <w:rStyle w:val="Hyperlink"/>
@@ -2457,7 +2457,7 @@
               <w:rPr>
                 <w:noProof/>
               </w:rPr>
-              <w:instrText xml:space="preserve"> PAGEREF _Toc240468899 \h </w:instrText>
+              <w:instrText xml:space="preserve"> PAGEREF _Toc240555514 \h </w:instrText>
             </w:r>
             <w:r>
               <w:rPr>
@@ -2494,7 +2494,7 @@
               <w:noProof/>
             </w:rPr>
           </w:pPr>
-          <w:hyperlink w:anchor="_Toc240468900" w:history="1">
+          <w:hyperlink w:anchor="_Toc240555515" w:history="1">
             <w:r>
               <w:rPr>
                 <w:rStyle w:val="Hyperlink"/>
@@ -2520,7 +2520,7 @@
               <w:rPr>
                 <w:noProof/>
               </w:rPr>
-              <w:instrText xml:space="preserve"> PAGEREF _Toc240468900 \h </w:instrText>
+              <w:instrText xml:space="preserve"> PAGEREF _Toc240555515 \h </w:instrText>
             </w:r>
             <w:r>
               <w:rPr>
@@ -2557,7 +2557,7 @@
               <w:noProof/>
             </w:rPr>
           </w:pPr>
-          <w:hyperlink w:anchor="_Toc240468901" w:history="1">
+          <w:hyperlink w:anchor="_Toc240555516" w:history="1">
             <w:r>
               <w:rPr>
                 <w:rStyle w:val="Hyperlink"/>
@@ -2583,7 +2583,7 @@
               <w:rPr>
                 <w:noProof/>
               </w:rPr>
-              <w:instrText xml:space="preserve"> PAGEREF _Toc240468901 \h </w:instrText>
+              <w:instrText xml:space="preserve"> PAGEREF _Toc240555516 \h </w:instrText>
             </w:r>
             <w:r>
               <w:rPr>
@@ -2620,7 +2620,7 @@
               <w:noProof/>
             </w:rPr>
           </w:pPr>
-          <w:hyperlink w:anchor="_Toc240468902" w:history="1">
+          <w:hyperlink w:anchor="_Toc240555517" w:history="1">
             <w:r>
               <w:rPr>
                 <w:rStyle w:val="Hyperlink"/>
@@ -2646,7 +2646,7 @@
               <w:rPr>
                 <w:noProof/>
               </w:rPr>
-              <w:instrText xml:space="preserve"> PAGEREF _Toc240468902 \h </w:instrText>
+              <w:instrText xml:space="preserve"> PAGEREF _Toc240555517 \h </w:instrText>
             </w:r>
             <w:r>
               <w:rPr>
@@ -2683,7 +2683,7 @@
               <w:noProof/>
             </w:rPr>
           </w:pPr>
-          <w:hyperlink w:anchor="_Toc240468903" w:history="1">
+          <w:hyperlink w:anchor="_Toc240555518" w:history="1">
             <w:r>
               <w:rPr>
                 <w:rStyle w:val="Hyperlink"/>
@@ -2709,7 +2709,7 @@
               <w:rPr>
                 <w:noProof/>
               </w:rPr>
-              <w:instrText xml:space="preserve"> PAGEREF _Toc240468903 \h </w:instrText>
+              <w:instrText xml:space="preserve"> PAGEREF _Toc240555518 \h </w:instrText>
             </w:r>
             <w:r>
               <w:rPr>
@@ -2746,7 +2746,7 @@
               <w:noProof/>
             </w:rPr>
           </w:pPr>
-          <w:hyperlink w:anchor="_Toc240468904" w:history="1">
+          <w:hyperlink w:anchor="_Toc240555519" w:history="1">
             <w:r>
               <w:rPr>
                 <w:rStyle w:val="Hyperlink"/>
@@ -2772,7 +2772,7 @@
               <w:rPr>
                 <w:noProof/>
               </w:rPr>
-              <w:instrText xml:space="preserve"> PAGEREF _Toc240468904 \h </w:instrText>
+              <w:instrText xml:space="preserve"> PAGEREF _Toc240555519 \h </w:instrText>
             </w:r>
             <w:r>
               <w:rPr>
@@ -2809,7 +2809,7 @@
               <w:noProof/>
             </w:rPr>
           </w:pPr>
-          <w:hyperlink w:anchor="_Toc240468905" w:history="1">
+          <w:hyperlink w:anchor="_Toc240555520" w:history="1">
             <w:r>
               <w:rPr>
                 <w:rStyle w:val="Hyperlink"/>
@@ -2835,7 +2835,7 @@
               <w:rPr>
                 <w:noProof/>
               </w:rPr>
-              <w:instrText xml:space="preserve"> PAGEREF _Toc240468905 \h </w:instrText>
+              <w:instrText xml:space="preserve"> PAGEREF _Toc240555520 \h </w:instrText>
             </w:r>
             <w:r>
               <w:rPr>
@@ -2872,7 +2872,7 @@
               <w:noProof/>
             </w:rPr>
           </w:pPr>
-          <w:hyperlink w:anchor="_Toc240468906" w:history="1">
+          <w:hyperlink w:anchor="_Toc240555521" w:history="1">
             <w:r>
               <w:rPr>
                 <w:rStyle w:val="Hyperlink"/>
@@ -2898,7 +2898,7 @@
               <w:rPr>
                 <w:noProof/>
               </w:rPr>
-              <w:instrText xml:space="preserve"> PAGEREF _Toc240468906 \h </w:instrText>
+              <w:instrText xml:space="preserve"> PAGEREF _Toc240555521 \h </w:instrText>
             </w:r>
             <w:r>
               <w:rPr>
@@ -2935,7 +2935,7 @@
               <w:noProof/>
             </w:rPr>
           </w:pPr>
-          <w:hyperlink w:anchor="_Toc240468907" w:history="1">
+          <w:hyperlink w:anchor="_Toc240555522" w:history="1">
             <w:r>
               <w:rPr>
                 <w:rStyle w:val="Hyperlink"/>
@@ -2961,7 +2961,7 @@
               <w:rPr>
                 <w:noProof/>
               </w:rPr>
-              <w:instrText xml:space="preserve"> PAGEREF _Toc240468907 \h </w:instrText>
+              <w:instrText xml:space="preserve"> PAGEREF _Toc240555522 \h </w:instrText>
             </w:r>
             <w:r>
               <w:rPr>
@@ -2998,7 +2998,7 @@
               <w:noProof/>
             </w:rPr>
           </w:pPr>
-          <w:hyperlink w:anchor="_Toc240468908" w:history="1">
+          <w:hyperlink w:anchor="_Toc240555523" w:history="1">
             <w:r>
               <w:rPr>
                 <w:rStyle w:val="Hyperlink"/>
@@ -3024,7 +3024,7 @@
               <w:rPr>
                 <w:noProof/>
               </w:rPr>
-              <w:instrText xml:space="preserve"> PAGEREF _Toc240468908 \h </w:instrText>
+              <w:instrText xml:space="preserve"> PAGEREF _Toc240555523 \h </w:instrText>
             </w:r>
             <w:r>
               <w:rPr>
@@ -3068,7 +3068,7 @@
         <w:pStyle w:val="Heading1"/>
         <w:spacing w:before="360" w:after="160"/>
       </w:pPr>
-      <w:bookmarkStart w:id="0" w:name="_Toc240468863"/>
+      <w:bookmarkStart w:id="0" w:name="_Toc240555478"/>
       <w:r>
         <w:rPr>
           <w:b/>
@@ -3128,12 +3128,18 @@
           <w:left w:w="10" w:type="dxa"/>
           <w:right w:w="10" w:type="dxa"/>
         </w:tblCellMar>
-        <w:tblLook w:val="04A0" w:firstRow="1" w:lastRow="0" w:firstColumn="1" w:lastColumn="0" w:noHBand="0" w:noVBand="1"/>
+        <w:tblLook w:val="0000" w:firstRow="0" w:lastRow="0" w:firstColumn="0" w:lastColumn="0" w:noHBand="0" w:noVBand="0"/>
       </w:tblPr>
       <w:tblGrid>
         <w:gridCol w:w="9360"/>
       </w:tblGrid>
       <w:tr>
+        <w:tblPrEx>
+          <w:tblCellMar>
+            <w:top w:w="0" w:type="dxa"/>
+            <w:bottom w:w="0" w:type="dxa"/>
+          </w:tblCellMar>
+        </w:tblPrEx>
         <w:tc>
           <w:tcPr>
             <w:tcW w:w="9360" w:type="dxa"/>
@@ -3190,7 +3196,7 @@
         <w:pStyle w:val="Heading1"/>
         <w:spacing w:before="360" w:after="160"/>
       </w:pPr>
-      <w:bookmarkStart w:id="1" w:name="_Toc240468864"/>
+      <w:bookmarkStart w:id="1" w:name="_Toc240555479"/>
       <w:r>
         <w:rPr>
           <w:b/>
@@ -3226,13 +3232,19 @@
           <w:left w:w="10" w:type="dxa"/>
           <w:right w:w="10" w:type="dxa"/>
         </w:tblCellMar>
-        <w:tblLook w:val="04A0" w:firstRow="1" w:lastRow="0" w:firstColumn="1" w:lastColumn="0" w:noHBand="0" w:noVBand="1"/>
+        <w:tblLook w:val="0000" w:firstRow="0" w:lastRow="0" w:firstColumn="0" w:lastColumn="0" w:noHBand="0" w:noVBand="0"/>
       </w:tblPr>
       <w:tblGrid>
         <w:gridCol w:w="2246"/>
         <w:gridCol w:w="7114"/>
       </w:tblGrid>
       <w:tr>
+        <w:tblPrEx>
+          <w:tblCellMar>
+            <w:top w:w="0" w:type="dxa"/>
+            <w:bottom w:w="0" w:type="dxa"/>
+          </w:tblCellMar>
+        </w:tblPrEx>
         <w:trPr>
           <w:tblHeader/>
         </w:trPr>
@@ -3284,6 +3296,12 @@
         </w:tc>
       </w:tr>
       <w:tr>
+        <w:tblPrEx>
+          <w:tblCellMar>
+            <w:top w:w="0" w:type="dxa"/>
+            <w:bottom w:w="0" w:type="dxa"/>
+          </w:tblCellMar>
+        </w:tblPrEx>
         <w:trPr>
           <w:cantSplit/>
         </w:trPr>
@@ -3329,6 +3347,12 @@
         </w:tc>
       </w:tr>
       <w:tr>
+        <w:tblPrEx>
+          <w:tblCellMar>
+            <w:top w:w="0" w:type="dxa"/>
+            <w:bottom w:w="0" w:type="dxa"/>
+          </w:tblCellMar>
+        </w:tblPrEx>
         <w:trPr>
           <w:cantSplit/>
         </w:trPr>
@@ -3374,6 +3398,12 @@
         </w:tc>
       </w:tr>
       <w:tr>
+        <w:tblPrEx>
+          <w:tblCellMar>
+            <w:top w:w="0" w:type="dxa"/>
+            <w:bottom w:w="0" w:type="dxa"/>
+          </w:tblCellMar>
+        </w:tblPrEx>
         <w:trPr>
           <w:cantSplit/>
         </w:trPr>
@@ -3419,6 +3449,12 @@
         </w:tc>
       </w:tr>
       <w:tr>
+        <w:tblPrEx>
+          <w:tblCellMar>
+            <w:top w:w="0" w:type="dxa"/>
+            <w:bottom w:w="0" w:type="dxa"/>
+          </w:tblCellMar>
+        </w:tblPrEx>
         <w:trPr>
           <w:cantSplit/>
         </w:trPr>
@@ -3464,6 +3500,12 @@
         </w:tc>
       </w:tr>
       <w:tr>
+        <w:tblPrEx>
+          <w:tblCellMar>
+            <w:top w:w="0" w:type="dxa"/>
+            <w:bottom w:w="0" w:type="dxa"/>
+          </w:tblCellMar>
+        </w:tblPrEx>
         <w:trPr>
           <w:cantSplit/>
         </w:trPr>
@@ -3509,6 +3551,12 @@
         </w:tc>
       </w:tr>
       <w:tr>
+        <w:tblPrEx>
+          <w:tblCellMar>
+            <w:top w:w="0" w:type="dxa"/>
+            <w:bottom w:w="0" w:type="dxa"/>
+          </w:tblCellMar>
+        </w:tblPrEx>
         <w:trPr>
           <w:cantSplit/>
         </w:trPr>
@@ -3554,6 +3602,12 @@
         </w:tc>
       </w:tr>
       <w:tr>
+        <w:tblPrEx>
+          <w:tblCellMar>
+            <w:top w:w="0" w:type="dxa"/>
+            <w:bottom w:w="0" w:type="dxa"/>
+          </w:tblCellMar>
+        </w:tblPrEx>
         <w:trPr>
           <w:cantSplit/>
         </w:trPr>
@@ -3599,6 +3653,12 @@
         </w:tc>
       </w:tr>
       <w:tr>
+        <w:tblPrEx>
+          <w:tblCellMar>
+            <w:top w:w="0" w:type="dxa"/>
+            <w:bottom w:w="0" w:type="dxa"/>
+          </w:tblCellMar>
+        </w:tblPrEx>
         <w:trPr>
           <w:cantSplit/>
         </w:trPr>
@@ -3644,6 +3704,12 @@
         </w:tc>
       </w:tr>
       <w:tr>
+        <w:tblPrEx>
+          <w:tblCellMar>
+            <w:top w:w="0" w:type="dxa"/>
+            <w:bottom w:w="0" w:type="dxa"/>
+          </w:tblCellMar>
+        </w:tblPrEx>
         <w:trPr>
           <w:cantSplit/>
         </w:trPr>
@@ -3689,6 +3755,12 @@
         </w:tc>
       </w:tr>
       <w:tr>
+        <w:tblPrEx>
+          <w:tblCellMar>
+            <w:top w:w="0" w:type="dxa"/>
+            <w:bottom w:w="0" w:type="dxa"/>
+          </w:tblCellMar>
+        </w:tblPrEx>
         <w:trPr>
           <w:cantSplit/>
         </w:trPr>
@@ -3735,6 +3807,12 @@
         </w:tc>
       </w:tr>
       <w:tr>
+        <w:tblPrEx>
+          <w:tblCellMar>
+            <w:top w:w="0" w:type="dxa"/>
+            <w:bottom w:w="0" w:type="dxa"/>
+          </w:tblCellMar>
+        </w:tblPrEx>
         <w:trPr>
           <w:cantSplit/>
         </w:trPr>
@@ -3780,6 +3858,12 @@
         </w:tc>
       </w:tr>
       <w:tr>
+        <w:tblPrEx>
+          <w:tblCellMar>
+            <w:top w:w="0" w:type="dxa"/>
+            <w:bottom w:w="0" w:type="dxa"/>
+          </w:tblCellMar>
+        </w:tblPrEx>
         <w:trPr>
           <w:cantSplit/>
         </w:trPr>
@@ -3830,7 +3914,7 @@
         <w:pStyle w:val="Heading1"/>
         <w:spacing w:before="360" w:after="160"/>
       </w:pPr>
-      <w:bookmarkStart w:id="2" w:name="_Toc240468865"/>
+      <w:bookmarkStart w:id="2" w:name="_Toc240555480"/>
       <w:r>
         <w:rPr>
           <w:b/>
@@ -3848,7 +3932,7 @@
         <w:pStyle w:val="Heading2"/>
         <w:spacing w:before="280" w:after="120"/>
       </w:pPr>
-      <w:bookmarkStart w:id="3" w:name="_Toc240468866"/>
+      <w:bookmarkStart w:id="3" w:name="_Toc240555481"/>
       <w:r>
         <w:rPr>
           <w:b/>
@@ -3884,7 +3968,7 @@
           <w:sz w:val="16"/>
           <w:szCs w:val="16"/>
         </w:rPr>
-        <w:t>X:\Multisource\                    (GitHub repo: retail-sector-health)</w:t>
+        <w:t>X:\retail-sector-health\        (the clone of github.com/EvyLynne/retail-sector-health)</w:t>
       </w:r>
     </w:p>
     <w:p>
@@ -4442,7 +4526,7 @@
         <w:pStyle w:val="Heading2"/>
         <w:spacing w:before="280" w:after="120"/>
       </w:pPr>
-      <w:bookmarkStart w:id="4" w:name="_Toc240468867"/>
+      <w:bookmarkStart w:id="4" w:name="_Toc240555482"/>
       <w:r>
         <w:rPr>
           <w:b/>
@@ -4469,7 +4553,7 @@
         <w:pStyle w:val="Heading2"/>
         <w:spacing w:before="280" w:after="120"/>
       </w:pPr>
-      <w:bookmarkStart w:id="5" w:name="_Toc240468868"/>
+      <w:bookmarkStart w:id="5" w:name="_Toc240555483"/>
       <w:r>
         <w:rPr>
           <w:b/>
@@ -4505,7 +4589,7 @@
           <w:left w:w="10" w:type="dxa"/>
           <w:right w:w="10" w:type="dxa"/>
         </w:tblCellMar>
-        <w:tblLook w:val="04A0" w:firstRow="1" w:lastRow="0" w:firstColumn="1" w:lastColumn="0" w:noHBand="0" w:noVBand="1"/>
+        <w:tblLook w:val="0000" w:firstRow="0" w:lastRow="0" w:firstColumn="0" w:lastColumn="0" w:noHBand="0" w:noVBand="0"/>
       </w:tblPr>
       <w:tblGrid>
         <w:gridCol w:w="2621"/>
@@ -4513,6 +4597,12 @@
         <w:gridCol w:w="4680"/>
       </w:tblGrid>
       <w:tr>
+        <w:tblPrEx>
+          <w:tblCellMar>
+            <w:top w:w="0" w:type="dxa"/>
+            <w:bottom w:w="0" w:type="dxa"/>
+          </w:tblCellMar>
+        </w:tblPrEx>
         <w:trPr>
           <w:tblHeader/>
         </w:trPr>
@@ -4587,6 +4677,12 @@
         </w:tc>
       </w:tr>
       <w:tr>
+        <w:tblPrEx>
+          <w:tblCellMar>
+            <w:top w:w="0" w:type="dxa"/>
+            <w:bottom w:w="0" w:type="dxa"/>
+          </w:tblCellMar>
+        </w:tblPrEx>
         <w:trPr>
           <w:cantSplit/>
         </w:trPr>
@@ -4652,6 +4748,12 @@
         </w:tc>
       </w:tr>
       <w:tr>
+        <w:tblPrEx>
+          <w:tblCellMar>
+            <w:top w:w="0" w:type="dxa"/>
+            <w:bottom w:w="0" w:type="dxa"/>
+          </w:tblCellMar>
+        </w:tblPrEx>
         <w:trPr>
           <w:cantSplit/>
         </w:trPr>
@@ -4717,6 +4819,12 @@
         </w:tc>
       </w:tr>
       <w:tr>
+        <w:tblPrEx>
+          <w:tblCellMar>
+            <w:top w:w="0" w:type="dxa"/>
+            <w:bottom w:w="0" w:type="dxa"/>
+          </w:tblCellMar>
+        </w:tblPrEx>
         <w:trPr>
           <w:cantSplit/>
         </w:trPr>
@@ -4782,6 +4890,12 @@
         </w:tc>
       </w:tr>
       <w:tr>
+        <w:tblPrEx>
+          <w:tblCellMar>
+            <w:top w:w="0" w:type="dxa"/>
+            <w:bottom w:w="0" w:type="dxa"/>
+          </w:tblCellMar>
+        </w:tblPrEx>
         <w:trPr>
           <w:cantSplit/>
         </w:trPr>
@@ -4894,7 +5008,7 @@
         <w:pStyle w:val="Heading1"/>
         <w:spacing w:before="360" w:after="160"/>
       </w:pPr>
-      <w:bookmarkStart w:id="6" w:name="_Toc240468869"/>
+      <w:bookmarkStart w:id="6" w:name="_Toc240555484"/>
       <w:r>
         <w:rPr>
           <w:b/>
@@ -4912,7 +5026,7 @@
         <w:pStyle w:val="Heading2"/>
         <w:spacing w:before="280" w:after="120"/>
       </w:pPr>
-      <w:bookmarkStart w:id="7" w:name="_Toc240468870"/>
+      <w:bookmarkStart w:id="7" w:name="_Toc240555485"/>
       <w:r>
         <w:rPr>
           <w:b/>
@@ -4977,7 +5091,7 @@
         <w:pStyle w:val="Heading2"/>
         <w:spacing w:before="280" w:after="120"/>
       </w:pPr>
-      <w:bookmarkStart w:id="8" w:name="_Toc240468871"/>
+      <w:bookmarkStart w:id="8" w:name="_Toc240555486"/>
       <w:r>
         <w:rPr>
           <w:b/>
@@ -5061,7 +5175,7 @@
         <w:pStyle w:val="Heading2"/>
         <w:spacing w:before="280" w:after="120"/>
       </w:pPr>
-      <w:bookmarkStart w:id="9" w:name="_Toc240468872"/>
+      <w:bookmarkStart w:id="9" w:name="_Toc240555487"/>
       <w:r>
         <w:rPr>
           <w:b/>
@@ -5601,12 +5715,18 @@
           <w:left w:w="10" w:type="dxa"/>
           <w:right w:w="10" w:type="dxa"/>
         </w:tblCellMar>
-        <w:tblLook w:val="04A0" w:firstRow="1" w:lastRow="0" w:firstColumn="1" w:lastColumn="0" w:noHBand="0" w:noVBand="1"/>
+        <w:tblLook w:val="0000" w:firstRow="0" w:lastRow="0" w:firstColumn="0" w:lastColumn="0" w:noHBand="0" w:noVBand="0"/>
       </w:tblPr>
       <w:tblGrid>
         <w:gridCol w:w="9360"/>
       </w:tblGrid>
       <w:tr>
+        <w:tblPrEx>
+          <w:tblCellMar>
+            <w:top w:w="0" w:type="dxa"/>
+            <w:bottom w:w="0" w:type="dxa"/>
+          </w:tblCellMar>
+        </w:tblPrEx>
         <w:tc>
           <w:tcPr>
             <w:tcW w:w="9360" w:type="dxa"/>
@@ -5676,7 +5796,7 @@
         <w:pStyle w:val="Heading2"/>
         <w:spacing w:before="280" w:after="120"/>
       </w:pPr>
-      <w:bookmarkStart w:id="10" w:name="_Toc240468873"/>
+      <w:bookmarkStart w:id="10" w:name="_Toc240555488"/>
       <w:r>
         <w:rPr>
           <w:b/>
@@ -5711,7 +5831,7 @@
         <w:pStyle w:val="Heading1"/>
         <w:spacing w:before="360" w:after="160"/>
       </w:pPr>
-      <w:bookmarkStart w:id="11" w:name="_Toc240468874"/>
+      <w:bookmarkStart w:id="11" w:name="_Toc240555489"/>
       <w:r>
         <w:rPr>
           <w:b/>
@@ -5720,27 +5840,7 @@
           <w:sz w:val="30"/>
           <w:szCs w:val="30"/>
         </w:rPr>
-        <w:t>5. Clone the Repository</w:t>
-      </w:r>
-      <w:r>
-        <w:rPr>
-          <w:b/>
-          <w:bCs/>
-          <w:color w:val="1F3864"/>
-          <w:sz w:val="30"/>
-          <w:szCs w:val="30"/>
-        </w:rPr>
-        <w:t xml:space="preserve"> And Setup </w:t>
-      </w:r>
-      <w:r>
-        <w:rPr>
-          <w:b/>
-          <w:bCs/>
-          <w:color w:val="1F3864"/>
-          <w:sz w:val="30"/>
-          <w:szCs w:val="30"/>
-        </w:rPr>
-        <w:t xml:space="preserve"> — Before Any Other Work</w:t>
+        <w:t>5. Clone the Repository — Before Any Other Work</w:t>
       </w:r>
       <w:bookmarkEnd w:id="11"/>
     </w:p>
@@ -5814,16 +5914,7 @@
         <w:spacing w:after="60" w:line="276" w:lineRule="auto"/>
       </w:pPr>
       <w:r>
-        <w:t xml:space="preserve">Clone: File → Clone repository → GitHub.com tab → select retail-sector-health → set the Local path </w:t>
-      </w:r>
-      <w:r>
-        <w:t xml:space="preserve">to preferred path </w:t>
-      </w:r>
-      <w:r>
-        <w:t xml:space="preserve"> → Clone. </w:t>
-      </w:r>
-      <w:r>
-        <w:t xml:space="preserve">Select preferred path. </w:t>
+        <w:t>Clone: File → Clone repository → GitHub.com tab → select retail-sector-health → set the Local path to X:\retail-sector-health → Clone. Do not accept the default path; the working copy for this project lives on X:.</w:t>
       </w:r>
     </w:p>
     <w:p>
@@ -5836,13 +5927,7 @@
         <w:spacing w:after="60" w:line="276" w:lineRule="auto"/>
       </w:pPr>
       <w:r>
-        <w:t xml:space="preserve">Verify: the app shows “No local changes” on branch main, and </w:t>
-      </w:r>
-      <w:r>
-        <w:t>the local machine path</w:t>
-      </w:r>
-      <w:r>
-        <w:t xml:space="preserve"> now contains the folder skeleton you created in §4.4. Every file this project produces from here on is saved inside that folder.</w:t>
+        <w:t>Verify: the app shows “No local changes” on branch main, and X:\retail-sector-health now contains the folder skeleton you created in §4.4. Every file this project produces from here on is saved inside that folder.</w:t>
       </w:r>
     </w:p>
     <w:p>
@@ -5860,19 +5945,6 @@
     </w:p>
     <w:p>
       <w:pPr>
-        <w:pStyle w:val="ListParagraph"/>
-        <w:numPr>
-          <w:ilvl w:val="0"/>
-          <w:numId w:val="6"/>
-        </w:numPr>
-        <w:spacing w:after="60" w:line="276" w:lineRule="auto"/>
-      </w:pPr>
-      <w:r>
-        <w:t xml:space="preserve">Copy the development documents from the staging folder to the repo.  Use the Publish-ToRepo.ps1 script in PowerShell if preferred. </w:t>
-      </w:r>
-    </w:p>
-    <w:p>
-      <w:pPr>
         <w:pBdr>
           <w:left w:val="single" w:sz="18" w:space="8" w:color="C0504D"/>
         </w:pBdr>
@@ -5902,6 +5974,9 @@
       <w:pPr>
         <w:pStyle w:val="Heading1"/>
         <w:spacing w:before="360" w:after="160"/>
+      </w:pPr>
+      <w:bookmarkStart w:id="12" w:name="_Toc240555490"/>
+      <w:r>
         <w:rPr>
           <w:b/>
           <w:bCs/>
@@ -5909,23 +5984,6 @@
           <w:sz w:val="30"/>
           <w:szCs w:val="30"/>
         </w:rPr>
-      </w:pPr>
-      <w:bookmarkStart w:id="12" w:name="_Toc240468875"/>
-    </w:p>
-    <w:p>
-      <w:pPr>
-        <w:pStyle w:val="Heading1"/>
-        <w:spacing w:before="360" w:after="160"/>
-      </w:pPr>
-      <w:r>
-        <w:rPr>
-          <w:b/>
-          <w:bCs/>
-          <w:color w:val="1F3864"/>
-          <w:sz w:val="30"/>
-          <w:szCs w:val="30"/>
-        </w:rPr>
-        <w:lastRenderedPageBreak/>
         <w:t>6. Local Development Environment</w:t>
       </w:r>
       <w:bookmarkEnd w:id="12"/>
@@ -5943,7 +6001,7 @@
         <w:pStyle w:val="Heading2"/>
         <w:spacing w:before="280" w:after="120"/>
       </w:pPr>
-      <w:bookmarkStart w:id="13" w:name="_Toc240468876"/>
+      <w:bookmarkStart w:id="13" w:name="_Toc240555491"/>
       <w:r>
         <w:rPr>
           <w:b/>
@@ -5952,6 +6010,7 @@
           <w:sz w:val="25"/>
           <w:szCs w:val="25"/>
         </w:rPr>
+        <w:lastRenderedPageBreak/>
         <w:t>6.1 Install order</w:t>
       </w:r>
       <w:bookmarkEnd w:id="13"/>
@@ -5971,7 +6030,7 @@
           <w:left w:w="10" w:type="dxa"/>
           <w:right w:w="10" w:type="dxa"/>
         </w:tblCellMar>
-        <w:tblLook w:val="04A0" w:firstRow="1" w:lastRow="0" w:firstColumn="1" w:lastColumn="0" w:noHBand="0" w:noVBand="1"/>
+        <w:tblLook w:val="0000" w:firstRow="0" w:lastRow="0" w:firstColumn="0" w:lastColumn="0" w:noHBand="0" w:noVBand="0"/>
       </w:tblPr>
       <w:tblGrid>
         <w:gridCol w:w="2434"/>
@@ -5979,6 +6038,12 @@
         <w:gridCol w:w="5054"/>
       </w:tblGrid>
       <w:tr>
+        <w:tblPrEx>
+          <w:tblCellMar>
+            <w:top w:w="0" w:type="dxa"/>
+            <w:bottom w:w="0" w:type="dxa"/>
+          </w:tblCellMar>
+        </w:tblPrEx>
         <w:trPr>
           <w:tblHeader/>
         </w:trPr>
@@ -6053,6 +6118,12 @@
         </w:tc>
       </w:tr>
       <w:tr>
+        <w:tblPrEx>
+          <w:tblCellMar>
+            <w:top w:w="0" w:type="dxa"/>
+            <w:bottom w:w="0" w:type="dxa"/>
+          </w:tblCellMar>
+        </w:tblPrEx>
         <w:trPr>
           <w:cantSplit/>
         </w:trPr>
@@ -6118,6 +6189,12 @@
         </w:tc>
       </w:tr>
       <w:tr>
+        <w:tblPrEx>
+          <w:tblCellMar>
+            <w:top w:w="0" w:type="dxa"/>
+            <w:bottom w:w="0" w:type="dxa"/>
+          </w:tblCellMar>
+        </w:tblPrEx>
         <w:trPr>
           <w:cantSplit/>
         </w:trPr>
@@ -6183,6 +6260,12 @@
         </w:tc>
       </w:tr>
       <w:tr>
+        <w:tblPrEx>
+          <w:tblCellMar>
+            <w:top w:w="0" w:type="dxa"/>
+            <w:bottom w:w="0" w:type="dxa"/>
+          </w:tblCellMar>
+        </w:tblPrEx>
         <w:trPr>
           <w:cantSplit/>
         </w:trPr>
@@ -6248,6 +6331,12 @@
         </w:tc>
       </w:tr>
       <w:tr>
+        <w:tblPrEx>
+          <w:tblCellMar>
+            <w:top w:w="0" w:type="dxa"/>
+            <w:bottom w:w="0" w:type="dxa"/>
+          </w:tblCellMar>
+        </w:tblPrEx>
         <w:trPr>
           <w:cantSplit/>
         </w:trPr>
@@ -6313,6 +6402,12 @@
         </w:tc>
       </w:tr>
       <w:tr>
+        <w:tblPrEx>
+          <w:tblCellMar>
+            <w:top w:w="0" w:type="dxa"/>
+            <w:bottom w:w="0" w:type="dxa"/>
+          </w:tblCellMar>
+        </w:tblPrEx>
         <w:trPr>
           <w:cantSplit/>
         </w:trPr>
@@ -6383,7 +6478,7 @@
         <w:pStyle w:val="Heading2"/>
         <w:spacing w:before="280" w:after="120"/>
       </w:pPr>
-      <w:bookmarkStart w:id="14" w:name="_Toc240468877"/>
+      <w:bookmarkStart w:id="14" w:name="_Toc240555492"/>
       <w:r>
         <w:rPr>
           <w:b/>
@@ -6419,40 +6514,24 @@
           <w:sz w:val="16"/>
           <w:szCs w:val="16"/>
         </w:rPr>
-        <w:t>X:\</w:t>
-      </w:r>
-      <w:r>
-        <w:rPr>
-          <w:rFonts w:ascii="Consolas" w:eastAsia="Consolas" w:hAnsi="Consolas" w:cs="Consolas"/>
-          <w:sz w:val="16"/>
-          <w:szCs w:val="16"/>
-        </w:rPr>
-        <w:t>retail-sector-health</w:t>
-      </w:r>
-      <w:r>
-        <w:rPr>
-          <w:rFonts w:ascii="Consolas" w:eastAsia="Consolas" w:hAnsi="Consolas" w:cs="Consolas"/>
-          <w:sz w:val="16"/>
-          <w:szCs w:val="16"/>
-        </w:rPr>
-        <w:t>\                     &lt;- the repository working copy; all tracked work</w:t>
-      </w:r>
-    </w:p>
-    <w:p>
-      <w:pPr>
-        <w:pBdr>
-          <w:left w:val="single" w:sz="12" w:space="6" w:color="A6A6A6"/>
-        </w:pBdr>
-        <w:shd w:val="clear" w:color="auto" w:fill="F2F2F2"/>
-        <w:ind w:left="180"/>
-      </w:pPr>
-      <w:r>
-        <w:rPr>
-          <w:rFonts w:ascii="Consolas" w:eastAsia="Consolas" w:hAnsi="Consolas" w:cs="Consolas"/>
-          <w:sz w:val="16"/>
-          <w:szCs w:val="16"/>
-        </w:rPr>
-        <w:t>C:\Data\RetailEconomics\            &lt;- the county CSV; NOT in the repo</w:t>
+        <w:t>X:\retail-sector-health\                    &lt;- the repository working copy; all tracked work</w:t>
+      </w:r>
+    </w:p>
+    <w:p>
+      <w:pPr>
+        <w:pBdr>
+          <w:left w:val="single" w:sz="12" w:space="6" w:color="A6A6A6"/>
+        </w:pBdr>
+        <w:shd w:val="clear" w:color="auto" w:fill="F2F2F2"/>
+        <w:ind w:left="180"/>
+      </w:pPr>
+      <w:r>
+        <w:rPr>
+          <w:rFonts w:ascii="Consolas" w:eastAsia="Consolas" w:hAnsi="Consolas" w:cs="Consolas"/>
+          <w:sz w:val="16"/>
+          <w:szCs w:val="16"/>
+        </w:rPr>
+        <w:t>C:\Data\RetailEconomics\                     &lt;- the county CSV; NOT in the repo</w:t>
       </w:r>
     </w:p>
     <w:p>
@@ -6470,7 +6549,7 @@
           <w:sz w:val="16"/>
           <w:szCs w:val="16"/>
         </w:rPr>
-        <w:t>C:\Users\&lt;You&gt;\Documents\Power BI Desktop\   &lt;- scratch .pbix experiments only</w:t>
+        <w:t>C:\Users\&lt;You&gt;\Documents\Power BI Desktop\  &lt;- staging and scratch .pbix; not the working copy</w:t>
       </w:r>
     </w:p>
     <w:p>
@@ -6497,28 +6576,34 @@
           <w:sz w:val="21"/>
           <w:szCs w:val="21"/>
         </w:rPr>
-        <w:t xml:space="preserve">Git works on a mapped network share but is noticeably slower, and GitHub Desktop occasionally reports file-lock errors mid-commit. If that happens, clone to a local path instead, work there, and copy the finished artifacts to </w:t>
-      </w:r>
-      <w:r>
-        <w:rPr>
+        <w:t>Git works on a mapped network share but is noticeably slower, and GitHub Desktop occasionally reports file-lock errors mid-commit. If that happens, clone to a local path instead, work there, and copy the finished artifacts to X:\retail-sector-health as a publishing step rather than as the working copy. Nothing else in this guide changes.</w:t>
+      </w:r>
+    </w:p>
+    <w:p>
+      <w:pPr>
+        <w:pBdr>
+          <w:left w:val="single" w:sz="18" w:space="8" w:color="C0504D"/>
+        </w:pBdr>
+        <w:shd w:val="clear" w:color="auto" w:fill="FBE9E7"/>
+        <w:spacing w:before="140" w:after="180" w:line="276" w:lineRule="auto"/>
+        <w:ind w:left="140" w:right="140"/>
+      </w:pPr>
+      <w:r>
+        <w:rPr>
+          <w:b/>
+          <w:bCs/>
+          <w:color w:val="963634"/>
           <w:sz w:val="21"/>
           <w:szCs w:val="21"/>
         </w:rPr>
-        <w:t>X:\retail-sector-health</w:t>
+        <w:t xml:space="preserve">Save Power BI files inside the clone, not beside it.  </w:t>
       </w:r>
       <w:r>
         <w:rPr>
           <w:sz w:val="21"/>
           <w:szCs w:val="21"/>
         </w:rPr>
-        <w:t xml:space="preserve"> </w:t>
-      </w:r>
-      <w:r>
-        <w:rPr>
-          <w:sz w:val="21"/>
-          <w:szCs w:val="21"/>
-        </w:rPr>
-        <w:t>as a publishing step rather than as the working copy. Nothing else in this guide changes.</w:t>
+        <w:t>Files saved anywhere else are not version-controlled. This is the single most common beginner mistake, and it is silent — everything appears to work until a week of measure changes turns out to have no history. The .pbip files belong in the clone’s pbip/ folder and nowhere else.</w:t>
       </w:r>
     </w:p>
     <w:p>
@@ -6526,7 +6611,7 @@
         <w:pStyle w:val="Heading2"/>
         <w:spacing w:before="280" w:after="120"/>
       </w:pPr>
-      <w:bookmarkStart w:id="15" w:name="_Toc240468878"/>
+      <w:bookmarkStart w:id="15" w:name="_Toc240555493"/>
       <w:r>
         <w:rPr>
           <w:b/>
@@ -6562,16 +6647,7 @@
         <w:spacing w:after="60" w:line="276" w:lineRule="auto"/>
       </w:pPr>
       <w:r>
-        <w:t xml:space="preserve">Open SSMS 22 and connect to </w:t>
-      </w:r>
-      <w:r>
-        <w:t>localhost\SQL</w:t>
-      </w:r>
-      <w:r>
-        <w:t>ServerDeveloperEdition</w:t>
-      </w:r>
-      <w:r>
-        <w:t>.</w:t>
+        <w:t>Open SSMS 22 and connect to BRUNO\MSSQLSERVER01.</w:t>
       </w:r>
     </w:p>
     <w:p>
@@ -6618,7 +6694,7 @@
         <w:pStyle w:val="Heading1"/>
         <w:spacing w:before="360" w:after="160"/>
       </w:pPr>
-      <w:bookmarkStart w:id="16" w:name="_Toc240468879"/>
+      <w:bookmarkStart w:id="16" w:name="_Toc240555494"/>
       <w:r>
         <w:rPr>
           <w:b/>
@@ -6646,7 +6722,7 @@
           <w:left w:w="10" w:type="dxa"/>
           <w:right w:w="10" w:type="dxa"/>
         </w:tblCellMar>
-        <w:tblLook w:val="04A0" w:firstRow="1" w:lastRow="0" w:firstColumn="1" w:lastColumn="0" w:noHBand="0" w:noVBand="1"/>
+        <w:tblLook w:val="0000" w:firstRow="0" w:lastRow="0" w:firstColumn="0" w:lastColumn="0" w:noHBand="0" w:noVBand="0"/>
       </w:tblPr>
       <w:tblGrid>
         <w:gridCol w:w="3182"/>
@@ -6654,6 +6730,12 @@
         <w:gridCol w:w="3744"/>
       </w:tblGrid>
       <w:tr>
+        <w:tblPrEx>
+          <w:tblCellMar>
+            <w:top w:w="0" w:type="dxa"/>
+            <w:bottom w:w="0" w:type="dxa"/>
+          </w:tblCellMar>
+        </w:tblPrEx>
         <w:trPr>
           <w:tblHeader/>
         </w:trPr>
@@ -6729,6 +6811,12 @@
         </w:tc>
       </w:tr>
       <w:tr>
+        <w:tblPrEx>
+          <w:tblCellMar>
+            <w:top w:w="0" w:type="dxa"/>
+            <w:bottom w:w="0" w:type="dxa"/>
+          </w:tblCellMar>
+        </w:tblPrEx>
         <w:trPr>
           <w:cantSplit/>
         </w:trPr>
@@ -6803,6 +6891,12 @@
         </w:tc>
       </w:tr>
       <w:tr>
+        <w:tblPrEx>
+          <w:tblCellMar>
+            <w:top w:w="0" w:type="dxa"/>
+            <w:bottom w:w="0" w:type="dxa"/>
+          </w:tblCellMar>
+        </w:tblPrEx>
         <w:trPr>
           <w:cantSplit/>
         </w:trPr>
@@ -6877,6 +6971,12 @@
         </w:tc>
       </w:tr>
       <w:tr>
+        <w:tblPrEx>
+          <w:tblCellMar>
+            <w:top w:w="0" w:type="dxa"/>
+            <w:bottom w:w="0" w:type="dxa"/>
+          </w:tblCellMar>
+        </w:tblPrEx>
         <w:trPr>
           <w:cantSplit/>
         </w:trPr>
@@ -6956,7 +7056,7 @@
         <w:pStyle w:val="Heading1"/>
         <w:spacing w:before="360" w:after="160"/>
       </w:pPr>
-      <w:bookmarkStart w:id="17" w:name="_Toc240468880"/>
+      <w:bookmarkStart w:id="17" w:name="_Toc240555495"/>
       <w:r>
         <w:rPr>
           <w:b/>
@@ -7052,7 +7152,7 @@
         <w:pStyle w:val="Heading1"/>
         <w:spacing w:before="360" w:after="160"/>
       </w:pPr>
-      <w:bookmarkStart w:id="18" w:name="_Toc240468881"/>
+      <w:bookmarkStart w:id="18" w:name="_Toc240555496"/>
       <w:r>
         <w:rPr>
           <w:b/>
@@ -7078,7 +7178,7 @@
         <w:pStyle w:val="Heading2"/>
         <w:spacing w:before="280" w:after="120"/>
       </w:pPr>
-      <w:bookmarkStart w:id="19" w:name="_Toc240468882"/>
+      <w:bookmarkStart w:id="19" w:name="_Toc240555497"/>
       <w:r>
         <w:rPr>
           <w:b/>
@@ -7129,393 +7229,6 @@
       <w:r>
         <w:t>Inspect what appeared: a &lt;name&gt;.SemanticModel folder holding tables, relationships and every DAX measure as readable TMDL text, and a &lt;name&gt;.Report folder holding page and visual definitions. These text files are what Git diffs.</w:t>
       </w:r>
-    </w:p>
-    <w:p>
-      <w:pPr>
-        <w:pStyle w:val="Heading2"/>
-        <w:spacing w:before="280" w:after="120"/>
-      </w:pPr>
-      <w:bookmarkStart w:id="20" w:name="_Toc240468883"/>
-      <w:r>
-        <w:rPr>
-          <w:b/>
-          <w:bCs/>
-          <w:color w:val="2E5496"/>
-          <w:sz w:val="25"/>
-          <w:szCs w:val="25"/>
-        </w:rPr>
-        <w:lastRenderedPageBreak/>
-        <w:t>9.2 The semantic model file</w:t>
-      </w:r>
-      <w:bookmarkEnd w:id="20"/>
-    </w:p>
-    <w:p>
-      <w:pPr>
-        <w:spacing w:after="120" w:line="276" w:lineRule="auto"/>
-      </w:pPr>
-      <w:r>
-        <w:t>The model is built and published first, because a live connection can only target a model that already exists in the Service.</w:t>
-      </w:r>
-    </w:p>
-    <w:p>
-      <w:pPr>
-        <w:pStyle w:val="ListParagraph"/>
-        <w:numPr>
-          <w:ilvl w:val="0"/>
-          <w:numId w:val="10"/>
-        </w:numPr>
-        <w:spacing w:after="60" w:line="276" w:lineRule="auto"/>
-      </w:pPr>
-      <w:r>
-        <w:t>Build all queries, relationships and measures in one Desktop file. Keep it to a single blank page — this file is a model, not a report.</w:t>
-      </w:r>
-    </w:p>
-    <w:p>
-      <w:pPr>
-        <w:pStyle w:val="ListParagraph"/>
-        <w:numPr>
-          <w:ilvl w:val="0"/>
-          <w:numId w:val="10"/>
-        </w:numPr>
-        <w:spacing w:after="60" w:line="276" w:lineRule="auto"/>
-      </w:pPr>
-      <w:r>
-        <w:t>File → Save As → .pbip → pbip/RetailEconomics_Model. Commit and push.</w:t>
-      </w:r>
-    </w:p>
-    <w:p>
-      <w:pPr>
-        <w:pStyle w:val="ListParagraph"/>
-        <w:numPr>
-          <w:ilvl w:val="0"/>
-          <w:numId w:val="10"/>
-        </w:numPr>
-        <w:spacing w:after="60" w:line="276" w:lineRule="auto"/>
-      </w:pPr>
-      <w:r>
-        <w:t>Publish it to the Power BI Pro workspace from Desktop.</w:t>
-      </w:r>
-    </w:p>
-    <w:p>
-      <w:pPr>
-        <w:pStyle w:val="ListParagraph"/>
-        <w:numPr>
-          <w:ilvl w:val="0"/>
-          <w:numId w:val="10"/>
-        </w:numPr>
-        <w:spacing w:after="60" w:line="276" w:lineRule="auto"/>
-      </w:pPr>
-      <w:r>
-        <w:t>Configure the gateway, credentials and refresh schedule on the semantic model in the Service.</w:t>
-      </w:r>
-    </w:p>
-    <w:p>
-      <w:pPr>
-        <w:pStyle w:val="Heading2"/>
-        <w:spacing w:before="280" w:after="120"/>
-      </w:pPr>
-      <w:bookmarkStart w:id="21" w:name="_Toc240468884"/>
-      <w:r>
-        <w:rPr>
-          <w:b/>
-          <w:bCs/>
-          <w:color w:val="2E5496"/>
-          <w:sz w:val="25"/>
-          <w:szCs w:val="25"/>
-        </w:rPr>
-        <w:t>9.3 The three thin reports</w:t>
-      </w:r>
-      <w:bookmarkEnd w:id="21"/>
-    </w:p>
-    <w:p>
-      <w:pPr>
-        <w:pStyle w:val="ListParagraph"/>
-        <w:numPr>
-          <w:ilvl w:val="0"/>
-          <w:numId w:val="11"/>
-        </w:numPr>
-        <w:spacing w:after="60" w:line="276" w:lineRule="auto"/>
-      </w:pPr>
-      <w:r>
-        <w:t>Open a new Power BI Desktop file. Get data → Power BI semantic models → select the published model. This creates the live connection.</w:t>
-      </w:r>
-    </w:p>
-    <w:p>
-      <w:pPr>
-        <w:pStyle w:val="ListParagraph"/>
-        <w:numPr>
-          <w:ilvl w:val="0"/>
-          <w:numId w:val="11"/>
-        </w:numPr>
-        <w:spacing w:after="60" w:line="276" w:lineRule="auto"/>
-      </w:pPr>
-      <w:r>
-        <w:t>Build the report pages. The Fields pane shows the shared model; the modelling tools are disabled, which is expected.</w:t>
-      </w:r>
-    </w:p>
-    <w:p>
-      <w:pPr>
-        <w:pStyle w:val="ListParagraph"/>
-        <w:numPr>
-          <w:ilvl w:val="0"/>
-          <w:numId w:val="11"/>
-        </w:numPr>
-        <w:spacing w:after="60" w:line="276" w:lineRule="auto"/>
-      </w:pPr>
-      <w:r>
-        <w:t>File → Save As → .pbip → pbip/R1_Retail_Sector_Health. Repeat for R2 and R3.</w:t>
-      </w:r>
-    </w:p>
-    <w:p>
-      <w:pPr>
-        <w:pStyle w:val="ListParagraph"/>
-        <w:numPr>
-          <w:ilvl w:val="0"/>
-          <w:numId w:val="11"/>
-        </w:numPr>
-        <w:spacing w:after="60" w:line="276" w:lineRule="auto"/>
-      </w:pPr>
-      <w:r>
-        <w:t>Commit. Note that these three folders contain a report definition and no TMDL — see the note in §3.3.</w:t>
-      </w:r>
-    </w:p>
-    <w:p>
-      <w:pPr>
-        <w:pBdr>
-          <w:left w:val="single" w:sz="18" w:space="8" w:color="C0504D"/>
-        </w:pBdr>
-        <w:shd w:val="clear" w:color="auto" w:fill="FBE9E7"/>
-        <w:spacing w:before="140" w:after="180" w:line="276" w:lineRule="auto"/>
-        <w:ind w:left="140" w:right="140"/>
-      </w:pPr>
-      <w:r>
-        <w:rPr>
-          <w:b/>
-          <w:bCs/>
-          <w:color w:val="963634"/>
-          <w:sz w:val="21"/>
-          <w:szCs w:val="21"/>
-        </w:rPr>
-        <w:t xml:space="preserve">Republishing the model updates all three reports.  </w:t>
-      </w:r>
-      <w:r>
-        <w:rPr>
-          <w:sz w:val="21"/>
-          <w:szCs w:val="21"/>
-        </w:rPr>
-        <w:t>Changing a measure means editing the model file, committing its TMDL diff, and republishing. The three reports pick the change up automatically; they are not edited and not republished. If you ever find yourself making the same measure edit in more than one file, the architecture has been broken.</w:t>
-      </w:r>
-    </w:p>
-    <w:p>
-      <w:pPr>
-        <w:pStyle w:val="Heading2"/>
-        <w:spacing w:before="280" w:after="120"/>
-      </w:pPr>
-      <w:bookmarkStart w:id="22" w:name="_Toc240468885"/>
-      <w:r>
-        <w:rPr>
-          <w:b/>
-          <w:bCs/>
-          <w:color w:val="2E5496"/>
-          <w:sz w:val="25"/>
-          <w:szCs w:val="25"/>
-        </w:rPr>
-        <w:t>9.4 The daily loop: save → review diff → commit → push</w:t>
-      </w:r>
-      <w:bookmarkEnd w:id="22"/>
-    </w:p>
-    <w:p>
-      <w:pPr>
-        <w:pStyle w:val="ListParagraph"/>
-        <w:numPr>
-          <w:ilvl w:val="0"/>
-          <w:numId w:val="12"/>
-        </w:numPr>
-        <w:spacing w:after="60" w:line="276" w:lineRule="auto"/>
-      </w:pPr>
-      <w:r>
-        <w:t>Work in Power BI Desktop on a .pbip saved inside the clone. Ctrl+S as usual.</w:t>
-      </w:r>
-    </w:p>
-    <w:p>
-      <w:pPr>
-        <w:pStyle w:val="ListParagraph"/>
-        <w:numPr>
-          <w:ilvl w:val="0"/>
-          <w:numId w:val="12"/>
-        </w:numPr>
-        <w:spacing w:after="60" w:line="276" w:lineRule="auto"/>
-      </w:pPr>
-      <w:r>
-        <w:t>Open GitHub Desktop: every changed TMDL or JSON file is listed with its diff. Read the diff — this is the self-review step, and it is where you catch the measure you edited by accident.</w:t>
-      </w:r>
-    </w:p>
-    <w:p>
-      <w:pPr>
-        <w:pStyle w:val="ListParagraph"/>
-        <w:numPr>
-          <w:ilvl w:val="0"/>
-          <w:numId w:val="12"/>
-        </w:numPr>
-        <w:spacing w:after="60" w:line="276" w:lineRule="auto"/>
-      </w:pPr>
-      <w:r>
-        <w:t>Type a summary describing the change (“Add channel measures and the 2019 baseline”) → Commit to main.</w:t>
-      </w:r>
-    </w:p>
-    <w:p>
-      <w:pPr>
-        <w:pStyle w:val="ListParagraph"/>
-        <w:numPr>
-          <w:ilvl w:val="0"/>
-          <w:numId w:val="12"/>
-        </w:numPr>
-        <w:spacing w:after="60" w:line="276" w:lineRule="auto"/>
-      </w:pPr>
-      <w:r>
-        <w:t>Click Push origin. Refresh the repository page in the browser; the commit is there.</w:t>
-      </w:r>
-    </w:p>
-    <w:p>
-      <w:pPr>
-        <w:pStyle w:val="ListParagraph"/>
-        <w:numPr>
-          <w:ilvl w:val="0"/>
-          <w:numId w:val="12"/>
-        </w:numPr>
-        <w:spacing w:after="60" w:line="276" w:lineRule="auto"/>
-      </w:pPr>
-      <w:r>
-        <w:t>Starting a session after any web uploads: click Fetch/Pull in GitHub Desktop first, so the local copy includes everything on GitHub.</w:t>
-      </w:r>
-    </w:p>
-    <w:p>
-      <w:pPr>
-        <w:pStyle w:val="Heading2"/>
-        <w:spacing w:before="280" w:after="120"/>
-      </w:pPr>
-      <w:bookmarkStart w:id="23" w:name="_Toc240468886"/>
-      <w:r>
-        <w:rPr>
-          <w:b/>
-          <w:bCs/>
-          <w:color w:val="2E5496"/>
-          <w:sz w:val="25"/>
-          <w:szCs w:val="25"/>
-        </w:rPr>
-        <w:t>9.5 Branching once, so you have done it</w:t>
-      </w:r>
-      <w:bookmarkEnd w:id="23"/>
-    </w:p>
-    <w:p>
-      <w:pPr>
-        <w:pStyle w:val="ListParagraph"/>
-        <w:numPr>
-          <w:ilvl w:val="0"/>
-          <w:numId w:val="13"/>
-        </w:numPr>
-        <w:spacing w:after="60" w:line="276" w:lineRule="auto"/>
-      </w:pPr>
-      <w:r>
-        <w:t>GitHub Desktop: Current Branch → New Branch → name it feature/channel-panel → based on main → Create. Desktop switches to it automatically.</w:t>
-      </w:r>
-    </w:p>
-    <w:p>
-      <w:pPr>
-        <w:pStyle w:val="ListParagraph"/>
-        <w:numPr>
-          <w:ilvl w:val="0"/>
-          <w:numId w:val="13"/>
-        </w:numPr>
-        <w:spacing w:after="60" w:line="276" w:lineRule="auto"/>
-      </w:pPr>
-      <w:r>
-        <w:t>Save a change, commit, then Publish branch.</w:t>
-      </w:r>
-    </w:p>
-    <w:p>
-      <w:pPr>
-        <w:pStyle w:val="ListParagraph"/>
-        <w:numPr>
-          <w:ilvl w:val="0"/>
-          <w:numId w:val="13"/>
-        </w:numPr>
-        <w:spacing w:after="60" w:line="276" w:lineRule="auto"/>
-      </w:pPr>
-      <w:r>
-        <w:t>On github.com a banner offers “Compare &amp; pull request”. Open it, review the TMDL diff, click Merge pull request → Confirm.</w:t>
-      </w:r>
-    </w:p>
-    <w:p>
-      <w:pPr>
-        <w:pStyle w:val="ListParagraph"/>
-        <w:numPr>
-          <w:ilvl w:val="0"/>
-          <w:numId w:val="13"/>
-        </w:numPr>
-        <w:spacing w:after="60" w:line="276" w:lineRule="auto"/>
-      </w:pPr>
-      <w:r>
-        <w:t>Back in GitHub Desktop: switch Current Branch to main → Pull. The merged change is in main.</w:t>
-      </w:r>
-    </w:p>
-    <w:p>
-      <w:pPr>
-        <w:pStyle w:val="ListParagraph"/>
-        <w:numPr>
-          <w:ilvl w:val="0"/>
-          <w:numId w:val="13"/>
-        </w:numPr>
-        <w:spacing w:after="60" w:line="276" w:lineRule="auto"/>
-      </w:pPr>
-      <w:r>
-        <w:lastRenderedPageBreak/>
-        <w:t>Solo work can commit straight to main. You now know the branch-and-PR route interviews ask about.</w:t>
-      </w:r>
-    </w:p>
-    <w:p>
-      <w:pPr>
-        <w:pStyle w:val="Heading1"/>
-        <w:spacing w:before="360" w:after="160"/>
-      </w:pPr>
-      <w:bookmarkStart w:id="24" w:name="_Toc240468887"/>
-      <w:r>
-        <w:rPr>
-          <w:b/>
-          <w:bCs/>
-          <w:color w:val="1F3864"/>
-          <w:sz w:val="30"/>
-          <w:szCs w:val="30"/>
-        </w:rPr>
-        <w:t>10. Syncing Power BI to GitHub Directly — Fabric Git Integration</w:t>
-      </w:r>
-      <w:bookmarkEnd w:id="24"/>
-    </w:p>
-    <w:p>
-      <w:pPr>
-        <w:spacing w:after="120" w:line="276" w:lineRule="auto"/>
-      </w:pPr>
-      <w:r>
-        <w:t>Power BI can connect to GitHub without GitHub Desktop and without a local clone, through Fabric Git integration. A workspace is linked to a repository and branch, and workspace items are committed and updated from inside the Power BI Service. It is the more modern route and worth knowing; it is not the default in this guide, for one specific reason given below.</w:t>
-      </w:r>
-    </w:p>
-    <w:p>
-      <w:pPr>
-        <w:pStyle w:val="Heading2"/>
-        <w:spacing w:before="280" w:after="120"/>
-      </w:pPr>
-      <w:bookmarkStart w:id="25" w:name="_Toc240468888"/>
-      <w:r>
-        <w:rPr>
-          <w:b/>
-          <w:bCs/>
-          <w:color w:val="2E5496"/>
-          <w:sz w:val="25"/>
-          <w:szCs w:val="25"/>
-        </w:rPr>
-        <w:t>10.1 What it does and what it needs</w:t>
-      </w:r>
-      <w:bookmarkEnd w:id="25"/>
     </w:p>
     <w:tbl>
       <w:tblPr>
@@ -7532,13 +7245,484 @@
           <w:left w:w="10" w:type="dxa"/>
           <w:right w:w="10" w:type="dxa"/>
         </w:tblCellMar>
-        <w:tblLook w:val="04A0" w:firstRow="1" w:lastRow="0" w:firstColumn="1" w:lastColumn="0" w:noHBand="0" w:noVBand="1"/>
+        <w:tblLook w:val="0000" w:firstRow="0" w:lastRow="0" w:firstColumn="0" w:lastColumn="0" w:noHBand="0" w:noVBand="0"/>
+      </w:tblPr>
+      <w:tblGrid>
+        <w:gridCol w:w="9360"/>
+      </w:tblGrid>
+      <w:tr>
+        <w:tblPrEx>
+          <w:tblCellMar>
+            <w:top w:w="0" w:type="dxa"/>
+            <w:bottom w:w="0" w:type="dxa"/>
+          </w:tblCellMar>
+        </w:tblPrEx>
+        <w:tc>
+          <w:tcPr>
+            <w:tcW w:w="9360" w:type="dxa"/>
+            <w:shd w:val="clear" w:color="auto" w:fill="EAF1F8"/>
+            <w:tcMar>
+              <w:top w:w="140" w:type="dxa"/>
+              <w:left w:w="180" w:type="dxa"/>
+              <w:bottom w:w="140" w:type="dxa"/>
+              <w:right w:w="180" w:type="dxa"/>
+            </w:tcMar>
+          </w:tcPr>
+          <w:p>
+            <w:pPr>
+              <w:spacing w:after="80"/>
+            </w:pPr>
+            <w:r>
+              <w:rPr>
+                <w:b/>
+                <w:bCs/>
+                <w:color w:val="1F3864"/>
+              </w:rPr>
+              <w:lastRenderedPageBreak/>
+              <w:t>Why PBIP is the interview story</w:t>
+            </w:r>
+          </w:p>
+          <w:p>
+            <w:pPr>
+              <w:spacing w:after="100" w:line="276" w:lineRule="auto"/>
+            </w:pPr>
+            <w:r>
+              <w:rPr>
+                <w:sz w:val="21"/>
+                <w:szCs w:val="21"/>
+              </w:rPr>
+              <w:t>Change one measure and the commit diff shows exactly that measure’s DAX, line by line — the same review experience a SQL team gets. Screenshot one such diff for the README; it is the single strongest “works like an engineer” image a Power BI portfolio can contain.</w:t>
+            </w:r>
+          </w:p>
+          <w:p>
+            <w:pPr>
+              <w:spacing w:line="276" w:lineRule="auto"/>
+            </w:pPr>
+            <w:r>
+              <w:rPr>
+                <w:sz w:val="21"/>
+                <w:szCs w:val="21"/>
+              </w:rPr>
+              <w:t>Verify before the first commit: PBIP’s .pbi/localSettings.json and cache files must appear grayed out as ignored in GitHub Desktop. The Section 4.3 .gitignore handles this.</w:t>
+            </w:r>
+          </w:p>
+        </w:tc>
+      </w:tr>
+    </w:tbl>
+    <w:p>
+      <w:pPr>
+        <w:pStyle w:val="Heading2"/>
+        <w:spacing w:before="280" w:after="120"/>
+      </w:pPr>
+      <w:bookmarkStart w:id="20" w:name="_Toc240555498"/>
+      <w:r>
+        <w:rPr>
+          <w:b/>
+          <w:bCs/>
+          <w:color w:val="2E5496"/>
+          <w:sz w:val="25"/>
+          <w:szCs w:val="25"/>
+        </w:rPr>
+        <w:t>9.2 The semantic model file</w:t>
+      </w:r>
+      <w:bookmarkEnd w:id="20"/>
+    </w:p>
+    <w:p>
+      <w:pPr>
+        <w:spacing w:after="120" w:line="276" w:lineRule="auto"/>
+      </w:pPr>
+      <w:r>
+        <w:t>The model is built and published first, because a live connection can only target a model that already exists in the Service.</w:t>
+      </w:r>
+    </w:p>
+    <w:p>
+      <w:pPr>
+        <w:pStyle w:val="ListParagraph"/>
+        <w:numPr>
+          <w:ilvl w:val="0"/>
+          <w:numId w:val="10"/>
+        </w:numPr>
+        <w:spacing w:after="60" w:line="276" w:lineRule="auto"/>
+      </w:pPr>
+      <w:r>
+        <w:t>Build all queries, relationships and measures in one Desktop file. Keep it to a single blank page — this file is a model, not a report.</w:t>
+      </w:r>
+    </w:p>
+    <w:p>
+      <w:pPr>
+        <w:pStyle w:val="ListParagraph"/>
+        <w:numPr>
+          <w:ilvl w:val="0"/>
+          <w:numId w:val="10"/>
+        </w:numPr>
+        <w:spacing w:after="60" w:line="276" w:lineRule="auto"/>
+      </w:pPr>
+      <w:r>
+        <w:t>File → Save As → .pbip → pbip/RetailEconomics_Model. Commit and push.</w:t>
+      </w:r>
+    </w:p>
+    <w:p>
+      <w:pPr>
+        <w:pStyle w:val="ListParagraph"/>
+        <w:numPr>
+          <w:ilvl w:val="0"/>
+          <w:numId w:val="10"/>
+        </w:numPr>
+        <w:spacing w:after="60" w:line="276" w:lineRule="auto"/>
+      </w:pPr>
+      <w:r>
+        <w:t>Publish it to the Power BI Pro workspace from Desktop.</w:t>
+      </w:r>
+    </w:p>
+    <w:p>
+      <w:pPr>
+        <w:pStyle w:val="ListParagraph"/>
+        <w:numPr>
+          <w:ilvl w:val="0"/>
+          <w:numId w:val="10"/>
+        </w:numPr>
+        <w:spacing w:after="60" w:line="276" w:lineRule="auto"/>
+      </w:pPr>
+      <w:r>
+        <w:t>Configure the gateway, credentials and refresh schedule on the semantic model in the Service.</w:t>
+      </w:r>
+    </w:p>
+    <w:p>
+      <w:pPr>
+        <w:pStyle w:val="Heading2"/>
+        <w:spacing w:before="280" w:after="120"/>
+      </w:pPr>
+      <w:bookmarkStart w:id="21" w:name="_Toc240555499"/>
+      <w:r>
+        <w:rPr>
+          <w:b/>
+          <w:bCs/>
+          <w:color w:val="2E5496"/>
+          <w:sz w:val="25"/>
+          <w:szCs w:val="25"/>
+        </w:rPr>
+        <w:t>9.3 The three thin reports</w:t>
+      </w:r>
+      <w:bookmarkEnd w:id="21"/>
+    </w:p>
+    <w:p>
+      <w:pPr>
+        <w:pStyle w:val="ListParagraph"/>
+        <w:numPr>
+          <w:ilvl w:val="0"/>
+          <w:numId w:val="11"/>
+        </w:numPr>
+        <w:spacing w:after="60" w:line="276" w:lineRule="auto"/>
+      </w:pPr>
+      <w:r>
+        <w:t>Open a new Power BI Desktop file. Get data → Power BI semantic models → select the published model. This creates the live connection.</w:t>
+      </w:r>
+    </w:p>
+    <w:p>
+      <w:pPr>
+        <w:pStyle w:val="ListParagraph"/>
+        <w:numPr>
+          <w:ilvl w:val="0"/>
+          <w:numId w:val="11"/>
+        </w:numPr>
+        <w:spacing w:after="60" w:line="276" w:lineRule="auto"/>
+      </w:pPr>
+      <w:r>
+        <w:t>Build the report pages. The Fields pane shows the shared model; the modelling tools are disabled, which is expected.</w:t>
+      </w:r>
+    </w:p>
+    <w:p>
+      <w:pPr>
+        <w:pStyle w:val="ListParagraph"/>
+        <w:numPr>
+          <w:ilvl w:val="0"/>
+          <w:numId w:val="11"/>
+        </w:numPr>
+        <w:spacing w:after="60" w:line="276" w:lineRule="auto"/>
+      </w:pPr>
+      <w:r>
+        <w:t>File → Save As → .pbip → pbip/R1_Retail_Sector_Health. Repeat for R2 and R3.</w:t>
+      </w:r>
+    </w:p>
+    <w:p>
+      <w:pPr>
+        <w:pStyle w:val="ListParagraph"/>
+        <w:numPr>
+          <w:ilvl w:val="0"/>
+          <w:numId w:val="11"/>
+        </w:numPr>
+        <w:spacing w:after="60" w:line="276" w:lineRule="auto"/>
+      </w:pPr>
+      <w:r>
+        <w:t>Commit. Note that these three folders contain a report definition and no TMDL — see the note in §3.3.</w:t>
+      </w:r>
+    </w:p>
+    <w:p>
+      <w:pPr>
+        <w:pBdr>
+          <w:left w:val="single" w:sz="18" w:space="8" w:color="C0504D"/>
+        </w:pBdr>
+        <w:shd w:val="clear" w:color="auto" w:fill="FBE9E7"/>
+        <w:spacing w:before="140" w:after="180" w:line="276" w:lineRule="auto"/>
+        <w:ind w:left="140" w:right="140"/>
+      </w:pPr>
+      <w:r>
+        <w:rPr>
+          <w:b/>
+          <w:bCs/>
+          <w:color w:val="963634"/>
+          <w:sz w:val="21"/>
+          <w:szCs w:val="21"/>
+        </w:rPr>
+        <w:t xml:space="preserve">Republishing the model updates all three reports.  </w:t>
+      </w:r>
+      <w:r>
+        <w:rPr>
+          <w:sz w:val="21"/>
+          <w:szCs w:val="21"/>
+        </w:rPr>
+        <w:t>Changing a measure means editing the model file, committing its TMDL diff, and republishing. The three reports pick the change up automatically; they are not edited and not republished. If you ever find yourself making the same measure edit in more than one file, the architecture has been broken.</w:t>
+      </w:r>
+    </w:p>
+    <w:p>
+      <w:pPr>
+        <w:pStyle w:val="Heading2"/>
+        <w:spacing w:before="280" w:after="120"/>
+      </w:pPr>
+      <w:bookmarkStart w:id="22" w:name="_Toc240555500"/>
+      <w:r>
+        <w:rPr>
+          <w:b/>
+          <w:bCs/>
+          <w:color w:val="2E5496"/>
+          <w:sz w:val="25"/>
+          <w:szCs w:val="25"/>
+        </w:rPr>
+        <w:t>9.4 The daily loop: save → review diff → commit → push</w:t>
+      </w:r>
+      <w:bookmarkEnd w:id="22"/>
+    </w:p>
+    <w:p>
+      <w:pPr>
+        <w:pStyle w:val="ListParagraph"/>
+        <w:numPr>
+          <w:ilvl w:val="0"/>
+          <w:numId w:val="12"/>
+        </w:numPr>
+        <w:spacing w:after="60" w:line="276" w:lineRule="auto"/>
+      </w:pPr>
+      <w:r>
+        <w:t>Work in Power BI Desktop on a .pbip saved inside the clone. Ctrl+S as usual.</w:t>
+      </w:r>
+    </w:p>
+    <w:p>
+      <w:pPr>
+        <w:pStyle w:val="ListParagraph"/>
+        <w:numPr>
+          <w:ilvl w:val="0"/>
+          <w:numId w:val="12"/>
+        </w:numPr>
+        <w:spacing w:after="60" w:line="276" w:lineRule="auto"/>
+      </w:pPr>
+      <w:r>
+        <w:t>Open GitHub Desktop: every changed TMDL or JSON file is listed with its diff. Read the diff — this is the self-review step, and it is where you catch the measure you edited by accident.</w:t>
+      </w:r>
+    </w:p>
+    <w:p>
+      <w:pPr>
+        <w:pStyle w:val="ListParagraph"/>
+        <w:numPr>
+          <w:ilvl w:val="0"/>
+          <w:numId w:val="12"/>
+        </w:numPr>
+        <w:spacing w:after="60" w:line="276" w:lineRule="auto"/>
+      </w:pPr>
+      <w:r>
+        <w:t>Type a summary describing the change (“Add channel measures and the 2019 baseline”) → Commit to main.</w:t>
+      </w:r>
+    </w:p>
+    <w:p>
+      <w:pPr>
+        <w:pStyle w:val="ListParagraph"/>
+        <w:numPr>
+          <w:ilvl w:val="0"/>
+          <w:numId w:val="12"/>
+        </w:numPr>
+        <w:spacing w:after="60" w:line="276" w:lineRule="auto"/>
+      </w:pPr>
+      <w:r>
+        <w:t>Click Push origin. Refresh the repository page in the browser; the commit is there.</w:t>
+      </w:r>
+    </w:p>
+    <w:p>
+      <w:pPr>
+        <w:pStyle w:val="ListParagraph"/>
+        <w:numPr>
+          <w:ilvl w:val="0"/>
+          <w:numId w:val="12"/>
+        </w:numPr>
+        <w:spacing w:after="60" w:line="276" w:lineRule="auto"/>
+      </w:pPr>
+      <w:r>
+        <w:t>Starting a session after any web uploads: click Fetch/Pull in GitHub Desktop first, so the local copy includes everything on GitHub.</w:t>
+      </w:r>
+    </w:p>
+    <w:p>
+      <w:pPr>
+        <w:pStyle w:val="Heading2"/>
+        <w:spacing w:before="280" w:after="120"/>
+      </w:pPr>
+      <w:bookmarkStart w:id="23" w:name="_Toc240555501"/>
+      <w:r>
+        <w:rPr>
+          <w:b/>
+          <w:bCs/>
+          <w:color w:val="2E5496"/>
+          <w:sz w:val="25"/>
+          <w:szCs w:val="25"/>
+        </w:rPr>
+        <w:lastRenderedPageBreak/>
+        <w:t>9.5 Branching once, so you have done it</w:t>
+      </w:r>
+      <w:bookmarkEnd w:id="23"/>
+    </w:p>
+    <w:p>
+      <w:pPr>
+        <w:pStyle w:val="ListParagraph"/>
+        <w:numPr>
+          <w:ilvl w:val="0"/>
+          <w:numId w:val="13"/>
+        </w:numPr>
+        <w:spacing w:after="60" w:line="276" w:lineRule="auto"/>
+      </w:pPr>
+      <w:r>
+        <w:t>GitHub Desktop: Current Branch → New Branch → name it feature/channel-panel → based on main → Create. Desktop switches to it automatically.</w:t>
+      </w:r>
+    </w:p>
+    <w:p>
+      <w:pPr>
+        <w:pStyle w:val="ListParagraph"/>
+        <w:numPr>
+          <w:ilvl w:val="0"/>
+          <w:numId w:val="13"/>
+        </w:numPr>
+        <w:spacing w:after="60" w:line="276" w:lineRule="auto"/>
+      </w:pPr>
+      <w:r>
+        <w:t>Save a change, commit, then Publish branch.</w:t>
+      </w:r>
+    </w:p>
+    <w:p>
+      <w:pPr>
+        <w:pStyle w:val="ListParagraph"/>
+        <w:numPr>
+          <w:ilvl w:val="0"/>
+          <w:numId w:val="13"/>
+        </w:numPr>
+        <w:spacing w:after="60" w:line="276" w:lineRule="auto"/>
+      </w:pPr>
+      <w:r>
+        <w:t>On github.com a banner offers “Compare &amp; pull request”. Open it, review the TMDL diff, click Merge pull request → Confirm.</w:t>
+      </w:r>
+    </w:p>
+    <w:p>
+      <w:pPr>
+        <w:pStyle w:val="ListParagraph"/>
+        <w:numPr>
+          <w:ilvl w:val="0"/>
+          <w:numId w:val="13"/>
+        </w:numPr>
+        <w:spacing w:after="60" w:line="276" w:lineRule="auto"/>
+      </w:pPr>
+      <w:r>
+        <w:t>Back in GitHub Desktop: switch Current Branch to main → Pull. The merged change is in main.</w:t>
+      </w:r>
+    </w:p>
+    <w:p>
+      <w:pPr>
+        <w:pStyle w:val="ListParagraph"/>
+        <w:numPr>
+          <w:ilvl w:val="0"/>
+          <w:numId w:val="13"/>
+        </w:numPr>
+        <w:spacing w:after="60" w:line="276" w:lineRule="auto"/>
+      </w:pPr>
+      <w:r>
+        <w:t>Solo work can commit straight to main. You now know the branch-and-PR route interviews ask about.</w:t>
+      </w:r>
+    </w:p>
+    <w:p>
+      <w:pPr>
+        <w:pStyle w:val="Heading1"/>
+        <w:spacing w:before="360" w:after="160"/>
+      </w:pPr>
+      <w:bookmarkStart w:id="24" w:name="_Toc240555502"/>
+      <w:r>
+        <w:rPr>
+          <w:b/>
+          <w:bCs/>
+          <w:color w:val="1F3864"/>
+          <w:sz w:val="30"/>
+          <w:szCs w:val="30"/>
+        </w:rPr>
+        <w:t>10. Syncing Power BI to GitHub Directly — Fabric Git Integration</w:t>
+      </w:r>
+      <w:bookmarkEnd w:id="24"/>
+    </w:p>
+    <w:p>
+      <w:pPr>
+        <w:spacing w:after="120" w:line="276" w:lineRule="auto"/>
+      </w:pPr>
+      <w:r>
+        <w:t>Power BI can connect to GitHub without GitHub Desktop and without a local clone, through Fabric Git integration. A workspace is linked to a repository and branch, and workspace items are committed and updated from inside the Power BI Service. It is the more modern route and worth knowing; it is not the default in this guide, for one specific reason given below.</w:t>
+      </w:r>
+    </w:p>
+    <w:p>
+      <w:pPr>
+        <w:pStyle w:val="Heading2"/>
+        <w:spacing w:before="280" w:after="120"/>
+      </w:pPr>
+      <w:bookmarkStart w:id="25" w:name="_Toc240555503"/>
+      <w:r>
+        <w:rPr>
+          <w:b/>
+          <w:bCs/>
+          <w:color w:val="2E5496"/>
+          <w:sz w:val="25"/>
+          <w:szCs w:val="25"/>
+        </w:rPr>
+        <w:t>10.1 What it does and what it needs</w:t>
+      </w:r>
+      <w:bookmarkEnd w:id="25"/>
+    </w:p>
+    <w:tbl>
+      <w:tblPr>
+        <w:tblW w:w="9360" w:type="dxa"/>
+        <w:tblBorders>
+          <w:top w:val="single" w:sz="4" w:space="0" w:color="auto"/>
+          <w:left w:val="single" w:sz="4" w:space="0" w:color="auto"/>
+          <w:bottom w:val="single" w:sz="4" w:space="0" w:color="auto"/>
+          <w:right w:val="single" w:sz="4" w:space="0" w:color="auto"/>
+          <w:insideH w:val="single" w:sz="4" w:space="0" w:color="auto"/>
+          <w:insideV w:val="single" w:sz="4" w:space="0" w:color="auto"/>
+        </w:tblBorders>
+        <w:tblCellMar>
+          <w:left w:w="10" w:type="dxa"/>
+          <w:right w:w="10" w:type="dxa"/>
+        </w:tblCellMar>
+        <w:tblLook w:val="0000" w:firstRow="0" w:lastRow="0" w:firstColumn="0" w:lastColumn="0" w:noHBand="0" w:noVBand="0"/>
       </w:tblPr>
       <w:tblGrid>
         <w:gridCol w:w="2621"/>
         <w:gridCol w:w="6739"/>
       </w:tblGrid>
       <w:tr>
+        <w:tblPrEx>
+          <w:tblCellMar>
+            <w:top w:w="0" w:type="dxa"/>
+            <w:bottom w:w="0" w:type="dxa"/>
+          </w:tblCellMar>
+        </w:tblPrEx>
         <w:trPr>
           <w:tblHeader/>
         </w:trPr>
@@ -7590,6 +7774,12 @@
         </w:tc>
       </w:tr>
       <w:tr>
+        <w:tblPrEx>
+          <w:tblCellMar>
+            <w:top w:w="0" w:type="dxa"/>
+            <w:bottom w:w="0" w:type="dxa"/>
+          </w:tblCellMar>
+        </w:tblPrEx>
         <w:trPr>
           <w:cantSplit/>
         </w:trPr>
@@ -7635,6 +7825,12 @@
         </w:tc>
       </w:tr>
       <w:tr>
+        <w:tblPrEx>
+          <w:tblCellMar>
+            <w:top w:w="0" w:type="dxa"/>
+            <w:bottom w:w="0" w:type="dxa"/>
+          </w:tblCellMar>
+        </w:tblPrEx>
         <w:trPr>
           <w:cantSplit/>
         </w:trPr>
@@ -7680,6 +7876,12 @@
         </w:tc>
       </w:tr>
       <w:tr>
+        <w:tblPrEx>
+          <w:tblCellMar>
+            <w:top w:w="0" w:type="dxa"/>
+            <w:bottom w:w="0" w:type="dxa"/>
+          </w:tblCellMar>
+        </w:tblPrEx>
         <w:trPr>
           <w:cantSplit/>
         </w:trPr>
@@ -7725,6 +7927,12 @@
         </w:tc>
       </w:tr>
       <w:tr>
+        <w:tblPrEx>
+          <w:tblCellMar>
+            <w:top w:w="0" w:type="dxa"/>
+            <w:bottom w:w="0" w:type="dxa"/>
+          </w:tblCellMar>
+        </w:tblPrEx>
         <w:trPr>
           <w:cantSplit/>
         </w:trPr>
@@ -7770,6 +7978,12 @@
         </w:tc>
       </w:tr>
       <w:tr>
+        <w:tblPrEx>
+          <w:tblCellMar>
+            <w:top w:w="0" w:type="dxa"/>
+            <w:bottom w:w="0" w:type="dxa"/>
+          </w:tblCellMar>
+        </w:tblPrEx>
         <w:trPr>
           <w:cantSplit/>
         </w:trPr>
@@ -7815,6 +8029,12 @@
         </w:tc>
       </w:tr>
       <w:tr>
+        <w:tblPrEx>
+          <w:tblCellMar>
+            <w:top w:w="0" w:type="dxa"/>
+            <w:bottom w:w="0" w:type="dxa"/>
+          </w:tblCellMar>
+        </w:tblPrEx>
         <w:trPr>
           <w:cantSplit/>
         </w:trPr>
@@ -7880,7 +8100,7 @@
         <w:pStyle w:val="Heading2"/>
         <w:spacing w:before="280" w:after="120"/>
       </w:pPr>
-      <w:bookmarkStart w:id="26" w:name="_Toc240468889"/>
+      <w:bookmarkStart w:id="26" w:name="_Toc240555504"/>
       <w:r>
         <w:rPr>
           <w:b/>
@@ -7942,6 +8162,7 @@
         <w:spacing w:after="60" w:line="276" w:lineRule="auto"/>
       </w:pPr>
       <w:r>
+        <w:lastRenderedPageBreak/>
         <w:t>Authorise the account on first use: supply a display name and complete the OAuth sign-in, then select Connect.</w:t>
       </w:r>
     </w:p>
@@ -7976,7 +8197,7 @@
         <w:pStyle w:val="Heading2"/>
         <w:spacing w:before="280" w:after="120"/>
       </w:pPr>
-      <w:bookmarkStart w:id="27" w:name="_Toc240468890"/>
+      <w:bookmarkStart w:id="27" w:name="_Toc240555505"/>
       <w:r>
         <w:rPr>
           <w:b/>
@@ -7999,11 +8220,7 @@
         <w:spacing w:after="60" w:line="276" w:lineRule="auto"/>
       </w:pPr>
       <w:r>
-        <w:lastRenderedPageBreak/>
-        <w:t>At the time of this writing, i</w:t>
-      </w:r>
-      <w:r>
-        <w:t>t requires a Fabric capacity. Every other part of this solution is specified on Power BI Pro, and adding a capacity requirement to publish a portfolio project changes the cost profile of the whole thing.</w:t>
+        <w:t>It requires a Fabric capacity. Every other part of this solution is specified on Power BI Pro, and adding a capacity requirement to publish a portfolio project changes the cost profile of the whole thing.</w:t>
       </w:r>
     </w:p>
     <w:p>
@@ -8077,7 +8294,7 @@
         <w:pStyle w:val="Heading1"/>
         <w:spacing w:before="360" w:after="160"/>
       </w:pPr>
-      <w:bookmarkStart w:id="28" w:name="_Toc240468891"/>
+      <w:bookmarkStart w:id="28" w:name="_Toc240555506"/>
       <w:r>
         <w:rPr>
           <w:b/>
@@ -8155,7 +8372,7 @@
         <w:pStyle w:val="Heading1"/>
         <w:spacing w:before="360" w:after="160"/>
       </w:pPr>
-      <w:bookmarkStart w:id="29" w:name="_Toc240468892"/>
+      <w:bookmarkStart w:id="29" w:name="_Toc240555507"/>
       <w:r>
         <w:rPr>
           <w:b/>
@@ -8164,6 +8381,7 @@
           <w:sz w:val="30"/>
           <w:szCs w:val="30"/>
         </w:rPr>
+        <w:lastRenderedPageBreak/>
         <w:t>12. The Census API Key</w:t>
       </w:r>
       <w:bookmarkEnd w:id="29"/>
@@ -8199,7 +8417,6 @@
         <w:spacing w:after="60" w:line="276" w:lineRule="auto"/>
       </w:pPr>
       <w:r>
-        <w:lastRenderedPageBreak/>
         <w:t>Before the first PBIP commit, open pbip/RetailEconomics_Model/ and search the TMDL text for “key=” and for the key’s first six characters. A parameter’s current value can be serialized depending on Desktop version and settings.</w:t>
       </w:r>
     </w:p>
@@ -8274,7 +8491,7 @@
         <w:pStyle w:val="Heading1"/>
         <w:spacing w:before="360" w:after="160"/>
       </w:pPr>
-      <w:bookmarkStart w:id="30" w:name="_Toc240468893"/>
+      <w:bookmarkStart w:id="30" w:name="_Toc240555508"/>
       <w:r>
         <w:rPr>
           <w:b/>
@@ -8735,6 +8952,7 @@
           <w:sz w:val="16"/>
           <w:szCs w:val="16"/>
         </w:rPr>
+        <w:lastRenderedPageBreak/>
         <w:t xml:space="preserve">  https://catalog.data.gov/dataset/warehouse-and-retail-sales</w:t>
       </w:r>
     </w:p>
@@ -8939,7 +9157,6 @@
           <w:sz w:val="16"/>
           <w:szCs w:val="16"/>
         </w:rPr>
-        <w:lastRenderedPageBreak/>
         <w:t>| theme/ | Report theme JSON |</w:t>
       </w:r>
     </w:p>
@@ -9077,7 +9294,7 @@
         <w:pStyle w:val="Heading1"/>
         <w:spacing w:before="360" w:after="160"/>
       </w:pPr>
-      <w:bookmarkStart w:id="31" w:name="_Toc240468894"/>
+      <w:bookmarkStart w:id="31" w:name="_Toc240555509"/>
       <w:r>
         <w:rPr>
           <w:b/>
@@ -9089,16 +9306,6 @@
         <w:t>14. Verification Checklist</w:t>
       </w:r>
       <w:bookmarkEnd w:id="31"/>
-      <w:r>
-        <w:rPr>
-          <w:b/>
-          <w:bCs/>
-          <w:color w:val="1F3864"/>
-          <w:sz w:val="30"/>
-          <w:szCs w:val="30"/>
-        </w:rPr>
-        <w:t xml:space="preserve"> Post Development</w:t>
-      </w:r>
     </w:p>
     <w:p>
       <w:pPr>
@@ -9248,7 +9455,7 @@
         <w:pStyle w:val="Heading1"/>
         <w:spacing w:before="360" w:after="160"/>
       </w:pPr>
-      <w:bookmarkStart w:id="32" w:name="_Toc240468895"/>
+      <w:bookmarkStart w:id="32" w:name="_Toc240555510"/>
       <w:r>
         <w:rPr>
           <w:b/>
@@ -9278,6 +9485,7 @@
           <w:sz w:val="21"/>
           <w:szCs w:val="21"/>
         </w:rPr>
+        <w:lastRenderedPageBreak/>
         <w:t xml:space="preserve">Power BI Desktop projects (PBIP) — the save format behind §8 — </w:t>
       </w:r>
       <w:hyperlink r:id="rId5" w:history="1">
@@ -9347,7 +9555,6 @@
           <w:sz w:val="21"/>
           <w:szCs w:val="21"/>
         </w:rPr>
-        <w:lastRenderedPageBreak/>
         <w:t xml:space="preserve">On-premises data gateway — </w:t>
       </w:r>
       <w:hyperlink r:id="rId8" w:history="1">
@@ -9463,7 +9670,7 @@
         <w:pStyle w:val="Heading1"/>
         <w:spacing w:before="360" w:after="160"/>
       </w:pPr>
-      <w:bookmarkStart w:id="33" w:name="_Toc240468896"/>
+      <w:bookmarkStart w:id="33" w:name="_Toc240555511"/>
       <w:r>
         <w:rPr>
           <w:b/>
@@ -9916,7 +10123,7 @@
         <w:pStyle w:val="Heading1"/>
         <w:spacing w:before="360" w:after="160"/>
       </w:pPr>
-      <w:bookmarkStart w:id="34" w:name="_Toc240468897"/>
+      <w:bookmarkStart w:id="34" w:name="_Toc240555512"/>
       <w:r>
         <w:rPr>
           <w:b/>
@@ -9944,7 +10151,7 @@
           <w:left w:w="10" w:type="dxa"/>
           <w:right w:w="10" w:type="dxa"/>
         </w:tblCellMar>
-        <w:tblLook w:val="04A0" w:firstRow="1" w:lastRow="0" w:firstColumn="1" w:lastColumn="0" w:noHBand="0" w:noVBand="1"/>
+        <w:tblLook w:val="0000" w:firstRow="0" w:lastRow="0" w:firstColumn="0" w:lastColumn="0" w:noHBand="0" w:noVBand="0"/>
       </w:tblPr>
       <w:tblGrid>
         <w:gridCol w:w="4111"/>
@@ -9953,6 +10160,12 @@
         <w:gridCol w:w="2722"/>
       </w:tblGrid>
       <w:tr>
+        <w:tblPrEx>
+          <w:tblCellMar>
+            <w:top w:w="0" w:type="dxa"/>
+            <w:bottom w:w="0" w:type="dxa"/>
+          </w:tblCellMar>
+        </w:tblPrEx>
         <w:trPr>
           <w:tblHeader/>
         </w:trPr>
@@ -9975,6 +10188,7 @@
                 <w:sz w:val="19"/>
                 <w:szCs w:val="19"/>
               </w:rPr>
+              <w:lastRenderedPageBreak/>
               <w:t>Artifact</w:t>
             </w:r>
           </w:p>
@@ -10050,6 +10264,12 @@
         </w:tc>
       </w:tr>
       <w:tr>
+        <w:tblPrEx>
+          <w:tblCellMar>
+            <w:top w:w="0" w:type="dxa"/>
+            <w:bottom w:w="0" w:type="dxa"/>
+          </w:tblCellMar>
+        </w:tblPrEx>
         <w:trPr>
           <w:cantSplit/>
         </w:trPr>
@@ -10135,6 +10355,12 @@
         </w:tc>
       </w:tr>
       <w:tr>
+        <w:tblPrEx>
+          <w:tblCellMar>
+            <w:top w:w="0" w:type="dxa"/>
+            <w:bottom w:w="0" w:type="dxa"/>
+          </w:tblCellMar>
+        </w:tblPrEx>
         <w:trPr>
           <w:cantSplit/>
         </w:trPr>
@@ -10220,6 +10446,12 @@
         </w:tc>
       </w:tr>
       <w:tr>
+        <w:tblPrEx>
+          <w:tblCellMar>
+            <w:top w:w="0" w:type="dxa"/>
+            <w:bottom w:w="0" w:type="dxa"/>
+          </w:tblCellMar>
+        </w:tblPrEx>
         <w:trPr>
           <w:cantSplit/>
         </w:trPr>
@@ -10239,7 +10471,6 @@
                 <w:sz w:val="19"/>
                 <w:szCs w:val="19"/>
               </w:rPr>
-              <w:lastRenderedPageBreak/>
               <w:t>02_Data_Setup_and_Semantic_Model_Guide.docx</w:t>
             </w:r>
           </w:p>
@@ -10306,6 +10537,12 @@
         </w:tc>
       </w:tr>
       <w:tr>
+        <w:tblPrEx>
+          <w:tblCellMar>
+            <w:top w:w="0" w:type="dxa"/>
+            <w:bottom w:w="0" w:type="dxa"/>
+          </w:tblCellMar>
+        </w:tblPrEx>
         <w:trPr>
           <w:cantSplit/>
         </w:trPr>
@@ -10391,6 +10628,12 @@
         </w:tc>
       </w:tr>
       <w:tr>
+        <w:tblPrEx>
+          <w:tblCellMar>
+            <w:top w:w="0" w:type="dxa"/>
+            <w:bottom w:w="0" w:type="dxa"/>
+          </w:tblCellMar>
+        </w:tblPrEx>
         <w:trPr>
           <w:cantSplit/>
         </w:trPr>
@@ -10476,6 +10719,12 @@
         </w:tc>
       </w:tr>
       <w:tr>
+        <w:tblPrEx>
+          <w:tblCellMar>
+            <w:top w:w="0" w:type="dxa"/>
+            <w:bottom w:w="0" w:type="dxa"/>
+          </w:tblCellMar>
+        </w:tblPrEx>
         <w:trPr>
           <w:cantSplit/>
         </w:trPr>
@@ -10561,6 +10810,12 @@
         </w:tc>
       </w:tr>
       <w:tr>
+        <w:tblPrEx>
+          <w:tblCellMar>
+            <w:top w:w="0" w:type="dxa"/>
+            <w:bottom w:w="0" w:type="dxa"/>
+          </w:tblCellMar>
+        </w:tblPrEx>
         <w:trPr>
           <w:cantSplit/>
         </w:trPr>
@@ -10646,6 +10901,12 @@
         </w:tc>
       </w:tr>
       <w:tr>
+        <w:tblPrEx>
+          <w:tblCellMar>
+            <w:top w:w="0" w:type="dxa"/>
+            <w:bottom w:w="0" w:type="dxa"/>
+          </w:tblCellMar>
+        </w:tblPrEx>
         <w:trPr>
           <w:cantSplit/>
         </w:trPr>
@@ -10731,6 +10992,12 @@
         </w:tc>
       </w:tr>
       <w:tr>
+        <w:tblPrEx>
+          <w:tblCellMar>
+            <w:top w:w="0" w:type="dxa"/>
+            <w:bottom w:w="0" w:type="dxa"/>
+          </w:tblCellMar>
+        </w:tblPrEx>
         <w:trPr>
           <w:cantSplit/>
         </w:trPr>
@@ -10816,6 +11083,12 @@
         </w:tc>
       </w:tr>
       <w:tr>
+        <w:tblPrEx>
+          <w:tblCellMar>
+            <w:top w:w="0" w:type="dxa"/>
+            <w:bottom w:w="0" w:type="dxa"/>
+          </w:tblCellMar>
+        </w:tblPrEx>
         <w:trPr>
           <w:cantSplit/>
         </w:trPr>
@@ -10901,6 +11174,12 @@
         </w:tc>
       </w:tr>
       <w:tr>
+        <w:tblPrEx>
+          <w:tblCellMar>
+            <w:top w:w="0" w:type="dxa"/>
+            <w:bottom w:w="0" w:type="dxa"/>
+          </w:tblCellMar>
+        </w:tblPrEx>
         <w:trPr>
           <w:cantSplit/>
         </w:trPr>
@@ -10986,6 +11265,12 @@
         </w:tc>
       </w:tr>
       <w:tr>
+        <w:tblPrEx>
+          <w:tblCellMar>
+            <w:top w:w="0" w:type="dxa"/>
+            <w:bottom w:w="0" w:type="dxa"/>
+          </w:tblCellMar>
+        </w:tblPrEx>
         <w:trPr>
           <w:cantSplit/>
         </w:trPr>
@@ -11071,6 +11356,12 @@
         </w:tc>
       </w:tr>
       <w:tr>
+        <w:tblPrEx>
+          <w:tblCellMar>
+            <w:top w:w="0" w:type="dxa"/>
+            <w:bottom w:w="0" w:type="dxa"/>
+          </w:tblCellMar>
+        </w:tblPrEx>
         <w:trPr>
           <w:cantSplit/>
         </w:trPr>
@@ -11156,6 +11447,12 @@
         </w:tc>
       </w:tr>
       <w:tr>
+        <w:tblPrEx>
+          <w:tblCellMar>
+            <w:top w:w="0" w:type="dxa"/>
+            <w:bottom w:w="0" w:type="dxa"/>
+          </w:tblCellMar>
+        </w:tblPrEx>
         <w:trPr>
           <w:cantSplit/>
         </w:trPr>
@@ -11241,6 +11538,12 @@
         </w:tc>
       </w:tr>
       <w:tr>
+        <w:tblPrEx>
+          <w:tblCellMar>
+            <w:top w:w="0" w:type="dxa"/>
+            <w:bottom w:w="0" w:type="dxa"/>
+          </w:tblCellMar>
+        </w:tblPrEx>
         <w:trPr>
           <w:cantSplit/>
         </w:trPr>
@@ -11326,6 +11629,12 @@
         </w:tc>
       </w:tr>
       <w:tr>
+        <w:tblPrEx>
+          <w:tblCellMar>
+            <w:top w:w="0" w:type="dxa"/>
+            <w:bottom w:w="0" w:type="dxa"/>
+          </w:tblCellMar>
+        </w:tblPrEx>
         <w:trPr>
           <w:cantSplit/>
         </w:trPr>
@@ -11411,6 +11720,12 @@
         </w:tc>
       </w:tr>
       <w:tr>
+        <w:tblPrEx>
+          <w:tblCellMar>
+            <w:top w:w="0" w:type="dxa"/>
+            <w:bottom w:w="0" w:type="dxa"/>
+          </w:tblCellMar>
+        </w:tblPrEx>
         <w:trPr>
           <w:cantSplit/>
         </w:trPr>
@@ -11501,7 +11816,7 @@
         <w:pStyle w:val="Heading1"/>
         <w:spacing w:before="360" w:after="160"/>
       </w:pPr>
-      <w:bookmarkStart w:id="35" w:name="_Toc240468898"/>
+      <w:bookmarkStart w:id="35" w:name="_Toc240555513"/>
       <w:r>
         <w:rPr>
           <w:b/>
@@ -11547,6 +11862,7 @@
           <w:sz w:val="21"/>
           <w:szCs w:val="21"/>
         </w:rPr>
+        <w:lastRenderedPageBreak/>
         <w:t xml:space="preserve">A folder README is not the root README.  </w:t>
       </w:r>
       <w:r>
@@ -11562,7 +11878,7 @@
         <w:pStyle w:val="Heading2"/>
         <w:spacing w:before="280" w:after="120"/>
       </w:pPr>
-      <w:bookmarkStart w:id="36" w:name="_Toc240468899"/>
+      <w:bookmarkStart w:id="36" w:name="_Toc240555514"/>
       <w:r>
         <w:rPr>
           <w:b/>
@@ -11580,7 +11896,6 @@
         <w:spacing w:after="120" w:line="276" w:lineRule="auto"/>
       </w:pPr>
       <w:r>
-        <w:lastRenderedPageBreak/>
         <w:t>The only folder whose contents are numbered for a reader rather than for a machine. The table doubles as the set register, so anyone landing here sees the whole document set without opening one.</w:t>
       </w:r>
     </w:p>
@@ -12084,7 +12399,7 @@
         <w:pStyle w:val="Heading2"/>
         <w:spacing w:before="280" w:after="120"/>
       </w:pPr>
-      <w:bookmarkStart w:id="37" w:name="_Toc240468900"/>
+      <w:bookmarkStart w:id="37" w:name="_Toc240555515"/>
       <w:r>
         <w:rPr>
           <w:b/>
@@ -12409,6 +12724,7 @@
           <w:sz w:val="16"/>
           <w:szCs w:val="16"/>
         </w:rPr>
+        <w:lastRenderedPageBreak/>
         <w:t>## Rules</w:t>
       </w:r>
     </w:p>
@@ -12546,7 +12862,6 @@
           <w:sz w:val="16"/>
           <w:szCs w:val="16"/>
         </w:rPr>
-        <w:lastRenderedPageBreak/>
         <w:t xml:space="preserve"> </w:t>
       </w:r>
     </w:p>
@@ -12555,7 +12870,7 @@
         <w:pStyle w:val="Heading2"/>
         <w:spacing w:before="280" w:after="120"/>
       </w:pPr>
-      <w:bookmarkStart w:id="38" w:name="_Toc240468901"/>
+      <w:bookmarkStart w:id="38" w:name="_Toc240555516"/>
       <w:r>
         <w:rPr>
           <w:b/>
@@ -12957,7 +13272,7 @@
         <w:pStyle w:val="Heading2"/>
         <w:spacing w:before="280" w:after="120"/>
       </w:pPr>
-      <w:bookmarkStart w:id="39" w:name="_Toc240468902"/>
+      <w:bookmarkStart w:id="39" w:name="_Toc240555517"/>
       <w:r>
         <w:rPr>
           <w:b/>
@@ -13333,153 +13648,153 @@
           <w:sz w:val="16"/>
           <w:szCs w:val="16"/>
         </w:rPr>
-        <w:t xml:space="preserve"> </w:t>
-      </w:r>
-    </w:p>
-    <w:p>
-      <w:pPr>
-        <w:pBdr>
-          <w:left w:val="single" w:sz="12" w:space="6" w:color="A6A6A6"/>
-        </w:pBdr>
-        <w:shd w:val="clear" w:color="auto" w:fill="F2F2F2"/>
-        <w:ind w:left="180"/>
-      </w:pPr>
-      <w:r>
-        <w:rPr>
-          <w:rFonts w:ascii="Consolas" w:eastAsia="Consolas" w:hAnsi="Consolas" w:cs="Consolas"/>
-          <w:sz w:val="16"/>
-          <w:szCs w:val="16"/>
-        </w:rPr>
-        <w:t>## Rules</w:t>
-      </w:r>
-    </w:p>
-    <w:p>
-      <w:pPr>
-        <w:pBdr>
-          <w:left w:val="single" w:sz="12" w:space="6" w:color="A6A6A6"/>
-        </w:pBdr>
-        <w:shd w:val="clear" w:color="auto" w:fill="F2F2F2"/>
-        <w:ind w:left="180"/>
-      </w:pPr>
-      <w:r>
-        <w:rPr>
-          <w:rFonts w:ascii="Consolas" w:eastAsia="Consolas" w:hAnsi="Consolas" w:cs="Consolas"/>
-          <w:sz w:val="16"/>
-          <w:szCs w:val="16"/>
-        </w:rPr>
-        <w:t>- Measures live in the semantic model only. A measure added inside a thin</w:t>
-      </w:r>
-    </w:p>
-    <w:p>
-      <w:pPr>
-        <w:pBdr>
-          <w:left w:val="single" w:sz="12" w:space="6" w:color="A6A6A6"/>
-        </w:pBdr>
-        <w:shd w:val="clear" w:color="auto" w:fill="F2F2F2"/>
-        <w:ind w:left="180"/>
-      </w:pPr>
-      <w:r>
-        <w:rPr>
-          <w:rFonts w:ascii="Consolas" w:eastAsia="Consolas" w:hAnsi="Consolas" w:cs="Consolas"/>
-          <w:sz w:val="16"/>
-          <w:szCs w:val="16"/>
-        </w:rPr>
-        <w:t xml:space="preserve">  report exists in that one report, which is the divergence the shared</w:t>
-      </w:r>
-    </w:p>
-    <w:p>
-      <w:pPr>
-        <w:pBdr>
-          <w:left w:val="single" w:sz="12" w:space="6" w:color="A6A6A6"/>
-        </w:pBdr>
-        <w:shd w:val="clear" w:color="auto" w:fill="F2F2F2"/>
-        <w:ind w:left="180"/>
-      </w:pPr>
-      <w:r>
-        <w:rPr>
-          <w:rFonts w:ascii="Consolas" w:eastAsia="Consolas" w:hAnsi="Consolas" w:cs="Consolas"/>
-          <w:sz w:val="16"/>
-          <w:szCs w:val="16"/>
-        </w:rPr>
-        <w:t xml:space="preserve">  model exists to prevent.</w:t>
-      </w:r>
-    </w:p>
-    <w:p>
-      <w:pPr>
-        <w:pBdr>
-          <w:left w:val="single" w:sz="12" w:space="6" w:color="A6A6A6"/>
-        </w:pBdr>
-        <w:shd w:val="clear" w:color="auto" w:fill="F2F2F2"/>
-        <w:ind w:left="180"/>
-      </w:pPr>
-      <w:r>
-        <w:rPr>
-          <w:rFonts w:ascii="Consolas" w:eastAsia="Consolas" w:hAnsi="Consolas" w:cs="Consolas"/>
-          <w:sz w:val="16"/>
-          <w:szCs w:val="16"/>
-        </w:rPr>
-        <w:t>- This folder is a readable mirror. Where it disagrees with the model,</w:t>
-      </w:r>
-    </w:p>
-    <w:p>
-      <w:pPr>
-        <w:pBdr>
-          <w:left w:val="single" w:sz="12" w:space="6" w:color="A6A6A6"/>
-        </w:pBdr>
-        <w:shd w:val="clear" w:color="auto" w:fill="F2F2F2"/>
-        <w:ind w:left="180"/>
-      </w:pPr>
-      <w:r>
-        <w:rPr>
-          <w:rFonts w:ascii="Consolas" w:eastAsia="Consolas" w:hAnsi="Consolas" w:cs="Consolas"/>
-          <w:sz w:val="16"/>
-          <w:szCs w:val="16"/>
-        </w:rPr>
-        <w:t xml:space="preserve">  the model is right and this folder is stale.</w:t>
-      </w:r>
-    </w:p>
-    <w:p>
-      <w:pPr>
-        <w:pBdr>
-          <w:left w:val="single" w:sz="12" w:space="6" w:color="A6A6A6"/>
-        </w:pBdr>
-        <w:shd w:val="clear" w:color="auto" w:fill="F2F2F2"/>
-        <w:ind w:left="180"/>
-      </w:pPr>
-      <w:r>
-        <w:rPr>
-          <w:rFonts w:ascii="Consolas" w:eastAsia="Consolas" w:hAnsi="Consolas" w:cs="Consolas"/>
-          <w:sz w:val="16"/>
-          <w:szCs w:val="16"/>
-        </w:rPr>
-        <w:t>- Leave a blank line between measures so a diff stays legible.</w:t>
-      </w:r>
-    </w:p>
-    <w:p>
-      <w:pPr>
-        <w:pBdr>
-          <w:left w:val="single" w:sz="12" w:space="6" w:color="A6A6A6"/>
-        </w:pBdr>
-        <w:shd w:val="clear" w:color="auto" w:fill="F2F2F2"/>
-        <w:spacing w:after="160"/>
-        <w:ind w:left="180"/>
-      </w:pPr>
-      <w:r>
-        <w:rPr>
-          <w:rFonts w:ascii="Consolas" w:eastAsia="Consolas" w:hAnsi="Consolas" w:cs="Consolas"/>
-          <w:sz w:val="16"/>
-          <w:szCs w:val="16"/>
-        </w:rPr>
         <w:lastRenderedPageBreak/>
         <w:t xml:space="preserve"> </w:t>
       </w:r>
     </w:p>
     <w:p>
       <w:pPr>
+        <w:pBdr>
+          <w:left w:val="single" w:sz="12" w:space="6" w:color="A6A6A6"/>
+        </w:pBdr>
+        <w:shd w:val="clear" w:color="auto" w:fill="F2F2F2"/>
+        <w:ind w:left="180"/>
+      </w:pPr>
+      <w:r>
+        <w:rPr>
+          <w:rFonts w:ascii="Consolas" w:eastAsia="Consolas" w:hAnsi="Consolas" w:cs="Consolas"/>
+          <w:sz w:val="16"/>
+          <w:szCs w:val="16"/>
+        </w:rPr>
+        <w:t>## Rules</w:t>
+      </w:r>
+    </w:p>
+    <w:p>
+      <w:pPr>
+        <w:pBdr>
+          <w:left w:val="single" w:sz="12" w:space="6" w:color="A6A6A6"/>
+        </w:pBdr>
+        <w:shd w:val="clear" w:color="auto" w:fill="F2F2F2"/>
+        <w:ind w:left="180"/>
+      </w:pPr>
+      <w:r>
+        <w:rPr>
+          <w:rFonts w:ascii="Consolas" w:eastAsia="Consolas" w:hAnsi="Consolas" w:cs="Consolas"/>
+          <w:sz w:val="16"/>
+          <w:szCs w:val="16"/>
+        </w:rPr>
+        <w:t>- Measures live in the semantic model only. A measure added inside a thin</w:t>
+      </w:r>
+    </w:p>
+    <w:p>
+      <w:pPr>
+        <w:pBdr>
+          <w:left w:val="single" w:sz="12" w:space="6" w:color="A6A6A6"/>
+        </w:pBdr>
+        <w:shd w:val="clear" w:color="auto" w:fill="F2F2F2"/>
+        <w:ind w:left="180"/>
+      </w:pPr>
+      <w:r>
+        <w:rPr>
+          <w:rFonts w:ascii="Consolas" w:eastAsia="Consolas" w:hAnsi="Consolas" w:cs="Consolas"/>
+          <w:sz w:val="16"/>
+          <w:szCs w:val="16"/>
+        </w:rPr>
+        <w:t xml:space="preserve">  report exists in that one report, which is the divergence the shared</w:t>
+      </w:r>
+    </w:p>
+    <w:p>
+      <w:pPr>
+        <w:pBdr>
+          <w:left w:val="single" w:sz="12" w:space="6" w:color="A6A6A6"/>
+        </w:pBdr>
+        <w:shd w:val="clear" w:color="auto" w:fill="F2F2F2"/>
+        <w:ind w:left="180"/>
+      </w:pPr>
+      <w:r>
+        <w:rPr>
+          <w:rFonts w:ascii="Consolas" w:eastAsia="Consolas" w:hAnsi="Consolas" w:cs="Consolas"/>
+          <w:sz w:val="16"/>
+          <w:szCs w:val="16"/>
+        </w:rPr>
+        <w:t xml:space="preserve">  model exists to prevent.</w:t>
+      </w:r>
+    </w:p>
+    <w:p>
+      <w:pPr>
+        <w:pBdr>
+          <w:left w:val="single" w:sz="12" w:space="6" w:color="A6A6A6"/>
+        </w:pBdr>
+        <w:shd w:val="clear" w:color="auto" w:fill="F2F2F2"/>
+        <w:ind w:left="180"/>
+      </w:pPr>
+      <w:r>
+        <w:rPr>
+          <w:rFonts w:ascii="Consolas" w:eastAsia="Consolas" w:hAnsi="Consolas" w:cs="Consolas"/>
+          <w:sz w:val="16"/>
+          <w:szCs w:val="16"/>
+        </w:rPr>
+        <w:t>- This folder is a readable mirror. Where it disagrees with the model,</w:t>
+      </w:r>
+    </w:p>
+    <w:p>
+      <w:pPr>
+        <w:pBdr>
+          <w:left w:val="single" w:sz="12" w:space="6" w:color="A6A6A6"/>
+        </w:pBdr>
+        <w:shd w:val="clear" w:color="auto" w:fill="F2F2F2"/>
+        <w:ind w:left="180"/>
+      </w:pPr>
+      <w:r>
+        <w:rPr>
+          <w:rFonts w:ascii="Consolas" w:eastAsia="Consolas" w:hAnsi="Consolas" w:cs="Consolas"/>
+          <w:sz w:val="16"/>
+          <w:szCs w:val="16"/>
+        </w:rPr>
+        <w:t xml:space="preserve">  the model is right and this folder is stale.</w:t>
+      </w:r>
+    </w:p>
+    <w:p>
+      <w:pPr>
+        <w:pBdr>
+          <w:left w:val="single" w:sz="12" w:space="6" w:color="A6A6A6"/>
+        </w:pBdr>
+        <w:shd w:val="clear" w:color="auto" w:fill="F2F2F2"/>
+        <w:ind w:left="180"/>
+      </w:pPr>
+      <w:r>
+        <w:rPr>
+          <w:rFonts w:ascii="Consolas" w:eastAsia="Consolas" w:hAnsi="Consolas" w:cs="Consolas"/>
+          <w:sz w:val="16"/>
+          <w:szCs w:val="16"/>
+        </w:rPr>
+        <w:t>- Leave a blank line between measures so a diff stays legible.</w:t>
+      </w:r>
+    </w:p>
+    <w:p>
+      <w:pPr>
+        <w:pBdr>
+          <w:left w:val="single" w:sz="12" w:space="6" w:color="A6A6A6"/>
+        </w:pBdr>
+        <w:shd w:val="clear" w:color="auto" w:fill="F2F2F2"/>
+        <w:spacing w:after="160"/>
+        <w:ind w:left="180"/>
+      </w:pPr>
+      <w:r>
+        <w:rPr>
+          <w:rFonts w:ascii="Consolas" w:eastAsia="Consolas" w:hAnsi="Consolas" w:cs="Consolas"/>
+          <w:sz w:val="16"/>
+          <w:szCs w:val="16"/>
+        </w:rPr>
+        <w:t xml:space="preserve"> </w:t>
+      </w:r>
+    </w:p>
+    <w:p>
+      <w:pPr>
         <w:pStyle w:val="Heading2"/>
         <w:spacing w:before="280" w:after="120"/>
       </w:pPr>
-      <w:bookmarkStart w:id="40" w:name="_Toc240468903"/>
+      <w:bookmarkStart w:id="40" w:name="_Toc240555518"/>
       <w:r>
         <w:rPr>
           <w:b/>
@@ -13932,7 +14247,7 @@
         <w:pStyle w:val="Heading2"/>
         <w:spacing w:before="280" w:after="120"/>
       </w:pPr>
-      <w:bookmarkStart w:id="41" w:name="_Toc240468904"/>
+      <w:bookmarkStart w:id="41" w:name="_Toc240555519"/>
       <w:r>
         <w:rPr>
           <w:b/>
@@ -14257,6 +14572,7 @@
           <w:sz w:val="16"/>
           <w:szCs w:val="16"/>
         </w:rPr>
+        <w:lastRenderedPageBreak/>
         <w:t>- The three report files carry no model. If one of them is more than a</w:t>
       </w:r>
     </w:p>
@@ -14300,7 +14616,7 @@
         <w:pStyle w:val="Heading2"/>
         <w:spacing w:before="280" w:after="120"/>
       </w:pPr>
-      <w:bookmarkStart w:id="42" w:name="_Toc240468905"/>
+      <w:bookmarkStart w:id="42" w:name="_Toc240555520"/>
       <w:r>
         <w:rPr>
           <w:b/>
@@ -14318,7 +14634,6 @@
         <w:spacing w:after="120" w:line="276" w:lineRule="auto"/>
       </w:pPr>
       <w:r>
-        <w:lastRenderedPageBreak/>
         <w:t>The folder that most needs a README, because a committed Excel file in a data project looks wrong until the reason is stated. The provenance breakdown is the reason.</w:t>
       </w:r>
     </w:p>
@@ -14822,7 +15137,7 @@
         <w:pStyle w:val="Heading2"/>
         <w:spacing w:before="280" w:after="120"/>
       </w:pPr>
-      <w:bookmarkStart w:id="43" w:name="_Toc240468906"/>
+      <w:bookmarkStart w:id="43" w:name="_Toc240555521"/>
       <w:r>
         <w:rPr>
           <w:b/>
@@ -15130,6 +15445,7 @@
           <w:sz w:val="16"/>
           <w:szCs w:val="16"/>
         </w:rPr>
+        <w:lastRenderedPageBreak/>
         <w:t>R3 scatter bubbles and the Pareto combo.</w:t>
       </w:r>
     </w:p>
@@ -15249,7 +15565,6 @@
           <w:sz w:val="16"/>
           <w:szCs w:val="16"/>
         </w:rPr>
-        <w:lastRenderedPageBreak/>
         <w:t>| dataColors[3] | #C8860A | Amber — markers, thresholds, warnings |</w:t>
       </w:r>
     </w:p>
@@ -15667,7 +15982,7 @@
         <w:pStyle w:val="Heading2"/>
         <w:spacing w:before="280" w:after="120"/>
       </w:pPr>
-      <w:bookmarkStart w:id="44" w:name="_Toc240468907"/>
+      <w:bookmarkStart w:id="44" w:name="_Toc240555522"/>
       <w:r>
         <w:rPr>
           <w:b/>
@@ -16035,7 +16350,7 @@
         <w:pStyle w:val="Heading1"/>
         <w:spacing w:before="360" w:after="160"/>
       </w:pPr>
-      <w:bookmarkStart w:id="45" w:name="_Toc240468908"/>
+      <w:bookmarkStart w:id="45" w:name="_Toc240555523"/>
       <w:r>
         <w:rPr>
           <w:b/>
@@ -16053,7 +16368,11 @@
         <w:spacing w:after="120" w:line="276" w:lineRule="auto"/>
       </w:pPr>
       <w:r>
-        <w:t>Portions of this document were drafted with the assistance of a generative AI system. The author reviewed all technical content prior to publication. Tool behaviour described here — PBIP serialization, live-connection capabilities and limits, and GitHub Desktop workflow — was verified against Microsoft documentation in September 2026. Procedures should be confirmed against the current release of each tool, since interface details change between versions.</w:t>
+        <w:t xml:space="preserve">Portions of this document were drafted with the assistance of a generative AI system. The author reviewed all technical content prior to publication. Tool behaviour described here — PBIP serialization, </w:t>
+      </w:r>
+      <w:r>
+        <w:lastRenderedPageBreak/>
+        <w:t>live-connection capabilities and limits, and GitHub Desktop workflow — was verified against Microsoft documentation in September 2026. Procedures should be confirmed against the current release of each tool, since interface details change between versions.</w:t>
       </w:r>
     </w:p>
     <w:sectPr>
@@ -16069,10 +16388,96 @@
 <file path=word/numbering.xml><?xml version="1.0" encoding="utf-8"?>
 <w:numbering xmlns:wpc="http://schemas.microsoft.com/office/word/2010/wordprocessingCanvas" xmlns:cx="http://schemas.microsoft.com/office/drawing/2014/chartex" xmlns:cx1="http://schemas.microsoft.com/office/drawing/2015/9/8/chartex" xmlns:cx2="http://schemas.microsoft.com/office/drawing/2015/10/21/chartex" xmlns:cx3="http://schemas.microsoft.com/office/drawing/2016/5/9/chartex" xmlns:cx4="http://schemas.microsoft.com/office/drawing/2016/5/10/chartex" xmlns:cx5="http://schemas.microsoft.com/office/drawing/2016/5/11/chartex" xmlns:cx6="http://schemas.microsoft.com/office/drawing/2016/5/12/chartex" xmlns:cx7="http://schemas.microsoft.com/office/drawing/2016/5/13/chartex" xmlns:cx8="http://schemas.microsoft.com/office/drawing/2016/5/14/chartex" xmlns:mc="http://schemas.openxmlformats.org/markup-compatibility/2006" xmlns:aink="http://schemas.microsoft.com/office/drawing/2016/ink" xmlns:am3d="http://schemas.microsoft.com/office/drawing/2017/model3d" xmlns:o="urn:schemas-microsoft-com:office:office" xmlns:oel="http://schemas.microsoft.com/office/2019/extlst" xmlns:r="http://schemas.openxmlformats.org/officeDocument/2006/relationships" xmlns:m="http://schemas.openxmlformats.org/officeDocument/2006/math" xmlns:v="urn:schemas-microsoft-com:vml" xmlns:wp14="http://schemas.microsoft.com/office/word/2010/wordprocessingDrawing" xmlns:wp="http://schemas.openxmlformats.org/drawingml/2006/wordprocessingDrawing" xmlns:w10="urn:schemas-microsoft-com:office:word" xmlns:w="http://schemas.openxmlformats.org/wordprocessingml/2006/main" xmlns:w14="http://schemas.microsoft.com/office/word/2010/wordml" xmlns:w15="http://schemas.microsoft.com/office/word/2012/wordml" xmlns:w16cex="http://schemas.microsoft.com/office/word/2018/wordml/cex" xmlns:w16cid="http://schemas.microsoft.com/office/word/2016/wordml/cid" xmlns:w16="http://schemas.microsoft.com/office/word/2018/wordml" xmlns:w16du="http://schemas.microsoft.com/office/word/2023/wordml/word16du" xmlns:w16sdtdh="http://schemas.microsoft.com/office/word/2020/wordml/sdtdatahash" xmlns:w16sdtfl="http://schemas.microsoft.com/office/word/2024/wordml/sdtformatlock" xmlns:w16se="http://schemas.microsoft.com/office/word/2015/wordml/symex" xmlns:wpg="http://schemas.microsoft.com/office/word/2010/wordprocessingGroup" xmlns:wpi="http://schemas.microsoft.com/office/word/2010/wordprocessingInk" xmlns:wne="http://schemas.microsoft.com/office/word/2006/wordml" xmlns:wps="http://schemas.microsoft.com/office/word/2010/wordprocessingShape" mc:Ignorable="w14 w15 w16se w16cid w16 w16cex w16sdtdh w16sdtfl w16du wp14">
   <w:abstractNum w:abstractNumId="0" w15:restartNumberingAfterBreak="0">
-    <w:nsid w:val="278E3E0B"/>
+    <w:nsid w:val="46224E24"/>
     <w:multiLevelType w:val="hybridMultilevel"/>
-    <w:tmpl w:val="C5B68640"/>
-    <w:lvl w:ilvl="0" w:tplc="C0BC904C">
+    <w:tmpl w:val="B7BC5B2A"/>
+    <w:lvl w:ilvl="0" w:tplc="F23434F6">
+      <w:start w:val="1"/>
+      <w:numFmt w:val="bullet"/>
+      <w:lvlText w:val="●"/>
+      <w:lvlJc w:val="left"/>
+      <w:pPr>
+        <w:ind w:left="720" w:hanging="360"/>
+      </w:pPr>
+    </w:lvl>
+    <w:lvl w:ilvl="1" w:tplc="110EB102">
+      <w:start w:val="1"/>
+      <w:numFmt w:val="bullet"/>
+      <w:lvlText w:val="○"/>
+      <w:lvlJc w:val="left"/>
+      <w:pPr>
+        <w:ind w:left="1440" w:hanging="360"/>
+      </w:pPr>
+    </w:lvl>
+    <w:lvl w:ilvl="2" w:tplc="32C8A9E0">
+      <w:start w:val="1"/>
+      <w:numFmt w:val="bullet"/>
+      <w:lvlText w:val="■"/>
+      <w:lvlJc w:val="left"/>
+      <w:pPr>
+        <w:ind w:left="2160" w:hanging="360"/>
+      </w:pPr>
+    </w:lvl>
+    <w:lvl w:ilvl="3" w:tplc="A5CAA5FA">
+      <w:start w:val="1"/>
+      <w:numFmt w:val="bullet"/>
+      <w:lvlText w:val="●"/>
+      <w:lvlJc w:val="left"/>
+      <w:pPr>
+        <w:ind w:left="2880" w:hanging="360"/>
+      </w:pPr>
+    </w:lvl>
+    <w:lvl w:ilvl="4" w:tplc="EF8EDAEA">
+      <w:start w:val="1"/>
+      <w:numFmt w:val="bullet"/>
+      <w:lvlText w:val="○"/>
+      <w:lvlJc w:val="left"/>
+      <w:pPr>
+        <w:ind w:left="3600" w:hanging="360"/>
+      </w:pPr>
+    </w:lvl>
+    <w:lvl w:ilvl="5" w:tplc="DF00B87E">
+      <w:start w:val="1"/>
+      <w:numFmt w:val="bullet"/>
+      <w:lvlText w:val="■"/>
+      <w:lvlJc w:val="left"/>
+      <w:pPr>
+        <w:ind w:left="4320" w:hanging="360"/>
+      </w:pPr>
+    </w:lvl>
+    <w:lvl w:ilvl="6" w:tplc="2E82BD98">
+      <w:start w:val="1"/>
+      <w:numFmt w:val="bullet"/>
+      <w:lvlText w:val="●"/>
+      <w:lvlJc w:val="left"/>
+      <w:pPr>
+        <w:ind w:left="5040" w:hanging="360"/>
+      </w:pPr>
+    </w:lvl>
+    <w:lvl w:ilvl="7" w:tplc="E8E2E64C">
+      <w:start w:val="1"/>
+      <w:numFmt w:val="bullet"/>
+      <w:lvlText w:val="●"/>
+      <w:lvlJc w:val="left"/>
+      <w:pPr>
+        <w:ind w:left="5760" w:hanging="360"/>
+      </w:pPr>
+    </w:lvl>
+    <w:lvl w:ilvl="8" w:tplc="899ED5EC">
+      <w:start w:val="1"/>
+      <w:numFmt w:val="bullet"/>
+      <w:lvlText w:val="●"/>
+      <w:lvlJc w:val="left"/>
+      <w:pPr>
+        <w:ind w:left="6480" w:hanging="360"/>
+      </w:pPr>
+    </w:lvl>
+  </w:abstractNum>
+  <w:abstractNum w:abstractNumId="1" w15:restartNumberingAfterBreak="0">
+    <w:nsid w:val="4A596DF6"/>
+    <w:multiLevelType w:val="hybridMultilevel"/>
+    <w:tmpl w:val="A09612B6"/>
+    <w:lvl w:ilvl="0" w:tplc="49B873FE">
       <w:start w:val="1"/>
       <w:numFmt w:val="bullet"/>
       <w:lvlText w:val="•"/>
@@ -16086,7 +16491,7 @@
         <w:szCs w:val="22"/>
       </w:rPr>
     </w:lvl>
-    <w:lvl w:ilvl="1" w:tplc="1F80FA32">
+    <w:lvl w:ilvl="1" w:tplc="6FC09F9A">
       <w:start w:val="1"/>
       <w:numFmt w:val="bullet"/>
       <w:lvlText w:val="◦"/>
@@ -16100,133 +16505,47 @@
         <w:szCs w:val="22"/>
       </w:rPr>
     </w:lvl>
-    <w:lvl w:ilvl="2" w:tplc="DEA4DB40">
+    <w:lvl w:ilvl="2" w:tplc="55065222">
       <w:numFmt w:val="decimal"/>
       <w:lvlText w:val=""/>
       <w:lvlJc w:val="left"/>
     </w:lvl>
-    <w:lvl w:ilvl="3" w:tplc="C4A473A2">
+    <w:lvl w:ilvl="3" w:tplc="50C64368">
       <w:numFmt w:val="decimal"/>
       <w:lvlText w:val=""/>
       <w:lvlJc w:val="left"/>
     </w:lvl>
-    <w:lvl w:ilvl="4" w:tplc="75AE10A8">
+    <w:lvl w:ilvl="4" w:tplc="45F2A664">
       <w:numFmt w:val="decimal"/>
       <w:lvlText w:val=""/>
       <w:lvlJc w:val="left"/>
     </w:lvl>
-    <w:lvl w:ilvl="5" w:tplc="421C9538">
+    <w:lvl w:ilvl="5" w:tplc="C204BC9C">
       <w:numFmt w:val="decimal"/>
       <w:lvlText w:val=""/>
       <w:lvlJc w:val="left"/>
     </w:lvl>
-    <w:lvl w:ilvl="6" w:tplc="EA240482">
+    <w:lvl w:ilvl="6" w:tplc="3C7259B0">
       <w:numFmt w:val="decimal"/>
       <w:lvlText w:val=""/>
       <w:lvlJc w:val="left"/>
     </w:lvl>
-    <w:lvl w:ilvl="7" w:tplc="5660368A">
+    <w:lvl w:ilvl="7" w:tplc="267E26B4">
       <w:numFmt w:val="decimal"/>
       <w:lvlText w:val=""/>
       <w:lvlJc w:val="left"/>
     </w:lvl>
-    <w:lvl w:ilvl="8" w:tplc="C8620A5C">
+    <w:lvl w:ilvl="8" w:tplc="3396649C">
       <w:numFmt w:val="decimal"/>
       <w:lvlText w:val=""/>
       <w:lvlJc w:val="left"/>
     </w:lvl>
   </w:abstractNum>
-  <w:abstractNum w:abstractNumId="1" w15:restartNumberingAfterBreak="0">
-    <w:nsid w:val="72974D92"/>
+  <w:abstractNum w:abstractNumId="2" w15:restartNumberingAfterBreak="0">
+    <w:nsid w:val="5F9473AC"/>
     <w:multiLevelType w:val="hybridMultilevel"/>
-    <w:tmpl w:val="560CA48E"/>
-    <w:lvl w:ilvl="0" w:tplc="881E730C">
-      <w:start w:val="1"/>
-      <w:numFmt w:val="bullet"/>
-      <w:lvlText w:val="●"/>
-      <w:lvlJc w:val="left"/>
-      <w:pPr>
-        <w:ind w:left="720" w:hanging="360"/>
-      </w:pPr>
-    </w:lvl>
-    <w:lvl w:ilvl="1" w:tplc="1B18ED86">
-      <w:start w:val="1"/>
-      <w:numFmt w:val="bullet"/>
-      <w:lvlText w:val="○"/>
-      <w:lvlJc w:val="left"/>
-      <w:pPr>
-        <w:ind w:left="1440" w:hanging="360"/>
-      </w:pPr>
-    </w:lvl>
-    <w:lvl w:ilvl="2" w:tplc="CEC63C80">
-      <w:start w:val="1"/>
-      <w:numFmt w:val="bullet"/>
-      <w:lvlText w:val="■"/>
-      <w:lvlJc w:val="left"/>
-      <w:pPr>
-        <w:ind w:left="2160" w:hanging="360"/>
-      </w:pPr>
-    </w:lvl>
-    <w:lvl w:ilvl="3" w:tplc="4D8C625A">
-      <w:start w:val="1"/>
-      <w:numFmt w:val="bullet"/>
-      <w:lvlText w:val="●"/>
-      <w:lvlJc w:val="left"/>
-      <w:pPr>
-        <w:ind w:left="2880" w:hanging="360"/>
-      </w:pPr>
-    </w:lvl>
-    <w:lvl w:ilvl="4" w:tplc="9258D4E0">
-      <w:start w:val="1"/>
-      <w:numFmt w:val="bullet"/>
-      <w:lvlText w:val="○"/>
-      <w:lvlJc w:val="left"/>
-      <w:pPr>
-        <w:ind w:left="3600" w:hanging="360"/>
-      </w:pPr>
-    </w:lvl>
-    <w:lvl w:ilvl="5" w:tplc="4AD0688C">
-      <w:start w:val="1"/>
-      <w:numFmt w:val="bullet"/>
-      <w:lvlText w:val="■"/>
-      <w:lvlJc w:val="left"/>
-      <w:pPr>
-        <w:ind w:left="4320" w:hanging="360"/>
-      </w:pPr>
-    </w:lvl>
-    <w:lvl w:ilvl="6" w:tplc="2BA01FB8">
-      <w:start w:val="1"/>
-      <w:numFmt w:val="bullet"/>
-      <w:lvlText w:val="●"/>
-      <w:lvlJc w:val="left"/>
-      <w:pPr>
-        <w:ind w:left="5040" w:hanging="360"/>
-      </w:pPr>
-    </w:lvl>
-    <w:lvl w:ilvl="7" w:tplc="269A57FC">
-      <w:start w:val="1"/>
-      <w:numFmt w:val="bullet"/>
-      <w:lvlText w:val="●"/>
-      <w:lvlJc w:val="left"/>
-      <w:pPr>
-        <w:ind w:left="5760" w:hanging="360"/>
-      </w:pPr>
-    </w:lvl>
-    <w:lvl w:ilvl="8" w:tplc="B770B5F8">
-      <w:start w:val="1"/>
-      <w:numFmt w:val="bullet"/>
-      <w:lvlText w:val="●"/>
-      <w:lvlJc w:val="left"/>
-      <w:pPr>
-        <w:ind w:left="6480" w:hanging="360"/>
-      </w:pPr>
-    </w:lvl>
-  </w:abstractNum>
-  <w:abstractNum w:abstractNumId="2" w15:restartNumberingAfterBreak="0">
-    <w:nsid w:val="79917528"/>
-    <w:multiLevelType w:val="hybridMultilevel"/>
-    <w:tmpl w:val="87EC112A"/>
-    <w:lvl w:ilvl="0" w:tplc="DA4E5E28">
+    <w:tmpl w:val="B0727F92"/>
+    <w:lvl w:ilvl="0" w:tplc="60F6476C">
       <w:start w:val="1"/>
       <w:numFmt w:val="decimal"/>
       <w:lvlText w:val="%1."/>
@@ -16240,144 +16559,144 @@
         <w:szCs w:val="22"/>
       </w:rPr>
     </w:lvl>
-    <w:lvl w:ilvl="1" w:tplc="7CD46BBC">
+    <w:lvl w:ilvl="1" w:tplc="4D60C4E8">
       <w:numFmt w:val="decimal"/>
       <w:lvlText w:val=""/>
       <w:lvlJc w:val="left"/>
     </w:lvl>
-    <w:lvl w:ilvl="2" w:tplc="AE2A2666">
+    <w:lvl w:ilvl="2" w:tplc="6D1AD62E">
       <w:numFmt w:val="decimal"/>
       <w:lvlText w:val=""/>
       <w:lvlJc w:val="left"/>
     </w:lvl>
-    <w:lvl w:ilvl="3" w:tplc="64CC4CE4">
+    <w:lvl w:ilvl="3" w:tplc="342AAA3E">
       <w:numFmt w:val="decimal"/>
       <w:lvlText w:val=""/>
       <w:lvlJc w:val="left"/>
     </w:lvl>
-    <w:lvl w:ilvl="4" w:tplc="426CBF0C">
+    <w:lvl w:ilvl="4" w:tplc="AC1A1550">
       <w:numFmt w:val="decimal"/>
       <w:lvlText w:val=""/>
       <w:lvlJc w:val="left"/>
     </w:lvl>
-    <w:lvl w:ilvl="5" w:tplc="EA485536">
+    <w:lvl w:ilvl="5" w:tplc="E7067012">
       <w:numFmt w:val="decimal"/>
       <w:lvlText w:val=""/>
       <w:lvlJc w:val="left"/>
     </w:lvl>
-    <w:lvl w:ilvl="6" w:tplc="6FF45EF2">
+    <w:lvl w:ilvl="6" w:tplc="C4F8D4B0">
       <w:numFmt w:val="decimal"/>
       <w:lvlText w:val=""/>
       <w:lvlJc w:val="left"/>
     </w:lvl>
-    <w:lvl w:ilvl="7" w:tplc="C600721A">
+    <w:lvl w:ilvl="7" w:tplc="02BAE608">
       <w:numFmt w:val="decimal"/>
       <w:lvlText w:val=""/>
       <w:lvlJc w:val="left"/>
     </w:lvl>
-    <w:lvl w:ilvl="8" w:tplc="EAB85AC2">
+    <w:lvl w:ilvl="8" w:tplc="4574F02A">
       <w:numFmt w:val="decimal"/>
       <w:lvlText w:val=""/>
       <w:lvlJc w:val="left"/>
     </w:lvl>
   </w:abstractNum>
-  <w:num w:numId="1" w16cid:durableId="1863589147">
+  <w:num w:numId="1" w16cid:durableId="1675306281">
+    <w:abstractNumId w:val="0"/>
+    <w:lvlOverride w:ilvl="0">
+      <w:startOverride w:val="1"/>
+    </w:lvlOverride>
+  </w:num>
+  <w:num w:numId="2" w16cid:durableId="221672142">
     <w:abstractNumId w:val="1"/>
     <w:lvlOverride w:ilvl="0">
       <w:startOverride w:val="1"/>
     </w:lvlOverride>
   </w:num>
-  <w:num w:numId="2" w16cid:durableId="1675494391">
-    <w:abstractNumId w:val="0"/>
-    <w:lvlOverride w:ilvl="0">
-      <w:startOverride w:val="1"/>
-    </w:lvlOverride>
-  </w:num>
-  <w:num w:numId="3" w16cid:durableId="633098206">
+  <w:num w:numId="3" w16cid:durableId="1464692420">
     <w:abstractNumId w:val="2"/>
     <w:lvlOverride w:ilvl="0">
       <w:startOverride w:val="1"/>
     </w:lvlOverride>
   </w:num>
-  <w:num w:numId="4" w16cid:durableId="1639609477">
+  <w:num w:numId="4" w16cid:durableId="1078136839">
     <w:abstractNumId w:val="2"/>
     <w:lvlOverride w:ilvl="0">
       <w:startOverride w:val="1"/>
     </w:lvlOverride>
   </w:num>
-  <w:num w:numId="5" w16cid:durableId="1056120921">
+  <w:num w:numId="5" w16cid:durableId="1902250470">
     <w:abstractNumId w:val="2"/>
     <w:lvlOverride w:ilvl="0">
       <w:startOverride w:val="1"/>
     </w:lvlOverride>
   </w:num>
-  <w:num w:numId="6" w16cid:durableId="1619558082">
+  <w:num w:numId="6" w16cid:durableId="1201359812">
     <w:abstractNumId w:val="2"/>
     <w:lvlOverride w:ilvl="0">
       <w:startOverride w:val="1"/>
     </w:lvlOverride>
   </w:num>
-  <w:num w:numId="7" w16cid:durableId="103892867">
+  <w:num w:numId="7" w16cid:durableId="155921529">
     <w:abstractNumId w:val="2"/>
     <w:lvlOverride w:ilvl="0">
       <w:startOverride w:val="1"/>
     </w:lvlOverride>
   </w:num>
-  <w:num w:numId="8" w16cid:durableId="1663436588">
+  <w:num w:numId="8" w16cid:durableId="1704600087">
     <w:abstractNumId w:val="2"/>
     <w:lvlOverride w:ilvl="0">
       <w:startOverride w:val="1"/>
     </w:lvlOverride>
   </w:num>
-  <w:num w:numId="9" w16cid:durableId="1934583833">
+  <w:num w:numId="9" w16cid:durableId="627056091">
     <w:abstractNumId w:val="2"/>
     <w:lvlOverride w:ilvl="0">
       <w:startOverride w:val="1"/>
     </w:lvlOverride>
   </w:num>
-  <w:num w:numId="10" w16cid:durableId="1943686175">
+  <w:num w:numId="10" w16cid:durableId="526065502">
     <w:abstractNumId w:val="2"/>
     <w:lvlOverride w:ilvl="0">
       <w:startOverride w:val="1"/>
     </w:lvlOverride>
   </w:num>
-  <w:num w:numId="11" w16cid:durableId="1502744192">
+  <w:num w:numId="11" w16cid:durableId="2090425562">
     <w:abstractNumId w:val="2"/>
     <w:lvlOverride w:ilvl="0">
       <w:startOverride w:val="1"/>
     </w:lvlOverride>
   </w:num>
-  <w:num w:numId="12" w16cid:durableId="1913350633">
+  <w:num w:numId="12" w16cid:durableId="932588035">
     <w:abstractNumId w:val="2"/>
     <w:lvlOverride w:ilvl="0">
       <w:startOverride w:val="1"/>
     </w:lvlOverride>
   </w:num>
-  <w:num w:numId="13" w16cid:durableId="30693154">
+  <w:num w:numId="13" w16cid:durableId="522326532">
     <w:abstractNumId w:val="2"/>
     <w:lvlOverride w:ilvl="0">
       <w:startOverride w:val="1"/>
     </w:lvlOverride>
   </w:num>
-  <w:num w:numId="14" w16cid:durableId="1772552897">
+  <w:num w:numId="14" w16cid:durableId="42170615">
     <w:abstractNumId w:val="2"/>
     <w:lvlOverride w:ilvl="0">
       <w:startOverride w:val="1"/>
     </w:lvlOverride>
   </w:num>
-  <w:num w:numId="15" w16cid:durableId="1570652075">
+  <w:num w:numId="15" w16cid:durableId="1741905123">
     <w:abstractNumId w:val="2"/>
     <w:lvlOverride w:ilvl="0">
       <w:startOverride w:val="1"/>
     </w:lvlOverride>
   </w:num>
-  <w:num w:numId="16" w16cid:durableId="1395815811">
+  <w:num w:numId="16" w16cid:durableId="1609002818">
     <w:abstractNumId w:val="2"/>
     <w:lvlOverride w:ilvl="0">
       <w:startOverride w:val="1"/>
     </w:lvlOverride>
   </w:num>
-  <w:num w:numId="17" w16cid:durableId="707921974">
+  <w:num w:numId="17" w16cid:durableId="1171336007">
     <w:abstractNumId w:val="2"/>
     <w:lvlOverride w:ilvl="0">
       <w:startOverride w:val="1"/>
@@ -16990,7 +17309,7 @@
     <w:autoRedefine/>
     <w:uiPriority w:val="39"/>
     <w:unhideWhenUsed/>
-    <w:rsid w:val="00DB7964"/>
+    <w:rsid w:val="00182B82"/>
     <w:pPr>
       <w:spacing w:after="100"/>
     </w:pPr>
@@ -17002,7 +17321,7 @@
     <w:autoRedefine/>
     <w:uiPriority w:val="39"/>
     <w:unhideWhenUsed/>
-    <w:rsid w:val="00DB7964"/>
+    <w:rsid w:val="00182B82"/>
     <w:pPr>
       <w:spacing w:after="100"/>
       <w:ind w:left="220"/>

</xml_diff>